<commit_message>
Add Instruction to application
</commit_message>
<xml_diff>
--- a/Instrukcje/Instrukcja do raportu sprzedaży.docx
+++ b/Instrukcje/Instrukcja do raportu sprzedaży.docx
@@ -169,7 +169,7 @@
           <w:r>
             <w:fldChar w:fldCharType="separate"/>
           </w:r>
-          <w:hyperlink w:anchor="_Toc202765166" w:history="1">
+          <w:hyperlink w:anchor="_Toc205276322" w:history="1">
             <w:r>
               <w:rPr>
                 <w:rStyle w:val="Hipercze"/>
@@ -211,7 +211,7 @@
                 <w:noProof/>
                 <w:webHidden/>
               </w:rPr>
-              <w:instrText xml:space="preserve"> PAGEREF _Toc202765166 \h </w:instrText>
+              <w:instrText xml:space="preserve"> PAGEREF _Toc205276322 \h </w:instrText>
             </w:r>
             <w:r>
               <w:rPr>
@@ -255,7 +255,7 @@
               <w:lang w:eastAsia="pl-PL"/>
             </w:rPr>
           </w:pPr>
-          <w:hyperlink w:anchor="_Toc202765167" w:history="1">
+          <w:hyperlink w:anchor="_Toc205276323" w:history="1">
             <w:r>
               <w:rPr>
                 <w:rStyle w:val="Hipercze"/>
@@ -297,7 +297,7 @@
                 <w:noProof/>
                 <w:webHidden/>
               </w:rPr>
-              <w:instrText xml:space="preserve"> PAGEREF _Toc202765167 \h </w:instrText>
+              <w:instrText xml:space="preserve"> PAGEREF _Toc205276323 \h </w:instrText>
             </w:r>
             <w:r>
               <w:rPr>
@@ -317,7 +317,7 @@
                 <w:noProof/>
                 <w:webHidden/>
               </w:rPr>
-              <w:t>5</w:t>
+              <w:t>6</w:t>
             </w:r>
             <w:r>
               <w:rPr>
@@ -341,7 +341,7 @@
               <w:lang w:eastAsia="pl-PL"/>
             </w:rPr>
           </w:pPr>
-          <w:hyperlink w:anchor="_Toc202765168" w:history="1">
+          <w:hyperlink w:anchor="_Toc205276324" w:history="1">
             <w:r>
               <w:rPr>
                 <w:rStyle w:val="Hipercze"/>
@@ -383,7 +383,7 @@
                 <w:noProof/>
                 <w:webHidden/>
               </w:rPr>
-              <w:instrText xml:space="preserve"> PAGEREF _Toc202765168 \h </w:instrText>
+              <w:instrText xml:space="preserve"> PAGEREF _Toc205276324 \h </w:instrText>
             </w:r>
             <w:r>
               <w:rPr>
@@ -403,7 +403,7 @@
                 <w:noProof/>
                 <w:webHidden/>
               </w:rPr>
-              <w:t>8</w:t>
+              <w:t>9</w:t>
             </w:r>
             <w:r>
               <w:rPr>
@@ -427,7 +427,7 @@
               <w:lang w:eastAsia="pl-PL"/>
             </w:rPr>
           </w:pPr>
-          <w:hyperlink w:anchor="_Toc202765169" w:history="1">
+          <w:hyperlink w:anchor="_Toc205276325" w:history="1">
             <w:r>
               <w:rPr>
                 <w:rStyle w:val="Hipercze"/>
@@ -469,7 +469,7 @@
                 <w:noProof/>
                 <w:webHidden/>
               </w:rPr>
-              <w:instrText xml:space="preserve"> PAGEREF _Toc202765169 \h </w:instrText>
+              <w:instrText xml:space="preserve"> PAGEREF _Toc205276325 \h </w:instrText>
             </w:r>
             <w:r>
               <w:rPr>
@@ -489,7 +489,7 @@
                 <w:noProof/>
                 <w:webHidden/>
               </w:rPr>
-              <w:t>11</w:t>
+              <w:t>12</w:t>
             </w:r>
             <w:r>
               <w:rPr>
@@ -513,7 +513,7 @@
               <w:lang w:eastAsia="pl-PL"/>
             </w:rPr>
           </w:pPr>
-          <w:hyperlink w:anchor="_Toc202765170" w:history="1">
+          <w:hyperlink w:anchor="_Toc205276326" w:history="1">
             <w:r>
               <w:rPr>
                 <w:rStyle w:val="Hipercze"/>
@@ -555,7 +555,7 @@
                 <w:noProof/>
                 <w:webHidden/>
               </w:rPr>
-              <w:instrText xml:space="preserve"> PAGEREF _Toc202765170 \h </w:instrText>
+              <w:instrText xml:space="preserve"> PAGEREF _Toc205276326 \h </w:instrText>
             </w:r>
             <w:r>
               <w:rPr>
@@ -575,7 +575,7 @@
                 <w:noProof/>
                 <w:webHidden/>
               </w:rPr>
-              <w:t>13</w:t>
+              <w:t>14</w:t>
             </w:r>
             <w:r>
               <w:rPr>
@@ -599,7 +599,7 @@
               <w:lang w:eastAsia="pl-PL"/>
             </w:rPr>
           </w:pPr>
-          <w:hyperlink w:anchor="_Toc202765171" w:history="1">
+          <w:hyperlink w:anchor="_Toc205276327" w:history="1">
             <w:r>
               <w:rPr>
                 <w:rStyle w:val="Hipercze"/>
@@ -641,7 +641,7 @@
                 <w:noProof/>
                 <w:webHidden/>
               </w:rPr>
-              <w:instrText xml:space="preserve"> PAGEREF _Toc202765171 \h </w:instrText>
+              <w:instrText xml:space="preserve"> PAGEREF _Toc205276327 \h </w:instrText>
             </w:r>
             <w:r>
               <w:rPr>
@@ -661,7 +661,7 @@
                 <w:noProof/>
                 <w:webHidden/>
               </w:rPr>
-              <w:t>15</w:t>
+              <w:t>16</w:t>
             </w:r>
             <w:r>
               <w:rPr>
@@ -685,7 +685,7 @@
               <w:lang w:eastAsia="pl-PL"/>
             </w:rPr>
           </w:pPr>
-          <w:hyperlink w:anchor="_Toc202765172" w:history="1">
+          <w:hyperlink w:anchor="_Toc205276328" w:history="1">
             <w:r>
               <w:rPr>
                 <w:rStyle w:val="Hipercze"/>
@@ -727,7 +727,7 @@
                 <w:noProof/>
                 <w:webHidden/>
               </w:rPr>
-              <w:instrText xml:space="preserve"> PAGEREF _Toc202765172 \h </w:instrText>
+              <w:instrText xml:space="preserve"> PAGEREF _Toc205276328 \h </w:instrText>
             </w:r>
             <w:r>
               <w:rPr>
@@ -747,7 +747,7 @@
                 <w:noProof/>
                 <w:webHidden/>
               </w:rPr>
-              <w:t>16</w:t>
+              <w:t>17</w:t>
             </w:r>
             <w:r>
               <w:rPr>
@@ -771,7 +771,7 @@
               <w:lang w:eastAsia="pl-PL"/>
             </w:rPr>
           </w:pPr>
-          <w:hyperlink w:anchor="_Toc202765173" w:history="1">
+          <w:hyperlink w:anchor="_Toc205276329" w:history="1">
             <w:r>
               <w:rPr>
                 <w:rStyle w:val="Hipercze"/>
@@ -813,7 +813,7 @@
                 <w:noProof/>
                 <w:webHidden/>
               </w:rPr>
-              <w:instrText xml:space="preserve"> PAGEREF _Toc202765173 \h </w:instrText>
+              <w:instrText xml:space="preserve"> PAGEREF _Toc205276329 \h </w:instrText>
             </w:r>
             <w:r>
               <w:rPr>
@@ -833,7 +833,7 @@
                 <w:noProof/>
                 <w:webHidden/>
               </w:rPr>
-              <w:t>18</w:t>
+              <w:t>19</w:t>
             </w:r>
             <w:r>
               <w:rPr>
@@ -878,7 +878,7 @@
       <w:pPr>
         <w:pStyle w:val="Nagwek2"/>
       </w:pPr>
-      <w:bookmarkStart w:id="0" w:name="_Toc202765166"/>
+      <w:bookmarkStart w:id="0" w:name="_Toc205276322"/>
       <w:r>
         <w:lastRenderedPageBreak/>
         <w:t>Przegląd miesiąca – widok podstawowy</w:t>
@@ -920,7 +920,7 @@
                     </pic:cNvPicPr>
                   </pic:nvPicPr>
                   <pic:blipFill>
-                    <a:blip r:embed="rId6" cstate="print">
+                    <a:blip r:embed="rId8" cstate="print">
                       <a:extLst>
                         <a:ext uri="{28A0092B-C50C-407E-A947-70E740481C1C}">
                           <a14:useLocalDpi xmlns:a14="http://schemas.microsoft.com/office/drawing/2010/main" val="0"/>
@@ -1072,16 +1072,7 @@
         <w:jc w:val="both"/>
       </w:pPr>
       <w:r>
-        <w:t>Zysk ze sprzedaży towarów netto</w:t>
-      </w:r>
-      <w:r>
-        <w:t xml:space="preserve"> bieżący miesiąc - przedstawia wartość </w:t>
-      </w:r>
-      <w:r>
-        <w:t>zysku</w:t>
-      </w:r>
-      <w:r>
-        <w:t xml:space="preserve"> dla towarów. Wartość obliczana jest na podstawie zaksięgowanych faktur.</w:t>
+        <w:t>Zysk ze sprzedaży towarów netto bieżący miesiąc - przedstawia wartość zysku dla towarów. Wartość obliczana jest na podstawie zaksięgowanych faktur.</w:t>
       </w:r>
     </w:p>
     <w:p>
@@ -1091,13 +1082,7 @@
       </w:pPr>
       <w:r>
         <w:lastRenderedPageBreak/>
-        <w:t xml:space="preserve">Wartość w wierszu „Poprzedni rok:” przedstawia </w:t>
-      </w:r>
-      <w:r>
-        <w:t>zysk ze sprzedaży</w:t>
-      </w:r>
-      <w:r>
-        <w:t xml:space="preserve"> towarów w analogicznym miesiącu w poprzednim roku oraz % bieżącej sprzedaży do sprzedaży w poprzednim roku.</w:t>
+        <w:t>Wartość w wierszu „Poprzedni rok:” przedstawia zysk ze sprzedaży towarów w analogicznym miesiącu w poprzednim roku oraz % bieżącej sprzedaży do sprzedaży w poprzednim roku.</w:t>
       </w:r>
     </w:p>
     <w:p>
@@ -1120,13 +1105,7 @@
         <w:jc w:val="both"/>
       </w:pPr>
       <w:r>
-        <w:t xml:space="preserve">Wartość w wierszu „Poprzedni rok:” przedstawia </w:t>
-      </w:r>
-      <w:r>
-        <w:t>marżę</w:t>
-      </w:r>
-      <w:r>
-        <w:t xml:space="preserve"> ze sprzedaży towarów w analogicznym miesiącu w poprzednim roku.</w:t>
+        <w:t>Wartość w wierszu „Poprzedni rok:” przedstawia marżę ze sprzedaży towarów w analogicznym miesiącu w poprzednim roku.</w:t>
       </w:r>
     </w:p>
     <w:p>
@@ -1374,7 +1353,7 @@
         <w:pStyle w:val="Nagwek2"/>
         <w:jc w:val="both"/>
       </w:pPr>
-      <w:bookmarkStart w:id="1" w:name="_Toc202765167"/>
+      <w:bookmarkStart w:id="1" w:name="_Toc205276323"/>
       <w:r>
         <w:lastRenderedPageBreak/>
         <w:t xml:space="preserve">Przegląd </w:t>
@@ -1415,7 +1394,7 @@
                     </pic:cNvPicPr>
                   </pic:nvPicPr>
                   <pic:blipFill>
-                    <a:blip r:embed="rId7">
+                    <a:blip r:embed="rId9">
                       <a:extLst>
                         <a:ext uri="{28A0092B-C50C-407E-A947-70E740481C1C}">
                           <a14:useLocalDpi xmlns:a14="http://schemas.microsoft.com/office/drawing/2010/main" val="0"/>
@@ -1636,7 +1615,7 @@
         <w:jc w:val="both"/>
       </w:pPr>
       <w:r>
-        <w:t>Zysk ze sprzedaży towarów netto bieżący miesiąc - przedstawia wartość zysku dla towarów.</w:t>
+        <w:t>Zysk ze sprzedaży towarów netto - przedstawia wartość zysku dla towarów.</w:t>
       </w:r>
     </w:p>
     <w:p>
@@ -1649,13 +1628,7 @@
         <w:jc w:val="both"/>
       </w:pPr>
       <w:r>
-        <w:t xml:space="preserve">Marża na towarach bieżący miesiąc – przedstawia marżę osiągnięta na sprzedaży towarów </w:t>
-      </w:r>
-      <w:r>
-        <w:t>uwzględniając wybrane filtry</w:t>
-      </w:r>
-      <w:r>
-        <w:t>.</w:t>
+        <w:t>Marża na towarach– przedstawia marżę osiągnięta na sprzedaży towarów uwzględniając wybrane filtry.</w:t>
       </w:r>
     </w:p>
     <w:p>
@@ -1793,9 +1766,9 @@
           <w:noProof/>
         </w:rPr>
         <w:drawing>
-          <wp:inline distT="0" distB="0" distL="0" distR="0" wp14:anchorId="3D0CC8D5" wp14:editId="028CC36E">
-            <wp:extent cx="5749925" cy="3189605"/>
-            <wp:effectExtent l="0" t="0" r="3175" b="0"/>
+          <wp:inline distT="0" distB="0" distL="0" distR="0" wp14:anchorId="3D0CC8D5" wp14:editId="193B95BF">
+            <wp:extent cx="5334425" cy="1377117"/>
+            <wp:effectExtent l="0" t="0" r="0" b="0"/>
             <wp:docPr id="1453101541" name="Obraz 2"/>
             <wp:cNvGraphicFramePr>
               <a:graphicFrameLocks xmlns:a="http://schemas.openxmlformats.org/drawingml/2006/main" noChangeAspect="1"/>
@@ -1809,15 +1782,15 @@
                       <a:picLocks noChangeAspect="1" noChangeArrowheads="1"/>
                     </pic:cNvPicPr>
                   </pic:nvPicPr>
-                  <pic:blipFill>
-                    <a:blip r:embed="rId8" cstate="print">
+                  <pic:blipFill rotWithShape="1">
+                    <a:blip r:embed="rId10" cstate="print">
                       <a:extLst>
                         <a:ext uri="{28A0092B-C50C-407E-A947-70E740481C1C}">
                           <a14:useLocalDpi xmlns:a14="http://schemas.microsoft.com/office/drawing/2010/main" val="0"/>
                         </a:ext>
                       </a:extLst>
                     </a:blip>
-                    <a:srcRect/>
+                    <a:srcRect t="10426" b="43036"/>
                     <a:stretch>
                       <a:fillRect/>
                     </a:stretch>
@@ -1825,7 +1798,7 @@
                   <pic:spPr bwMode="auto">
                     <a:xfrm>
                       <a:off x="0" y="0"/>
-                      <a:ext cx="5749925" cy="3189605"/>
+                      <a:ext cx="5377327" cy="1388193"/>
                     </a:xfrm>
                     <a:prstGeom prst="rect">
                       <a:avLst/>
@@ -1834,6 +1807,11 @@
                     <a:ln>
                       <a:noFill/>
                     </a:ln>
+                    <a:extLst>
+                      <a:ext uri="{53640926-AAD7-44D8-BBD7-CCE9431645EC}">
+                        <a14:shadowObscured xmlns:a14="http://schemas.microsoft.com/office/drawing/2010/main"/>
+                      </a:ext>
+                    </a:extLst>
                   </pic:spPr>
                 </pic:pic>
               </a:graphicData>
@@ -1865,11 +1843,10 @@
         <w:rPr>
           <w:noProof/>
         </w:rPr>
-        <w:lastRenderedPageBreak/>
         <w:drawing>
-          <wp:inline distT="0" distB="0" distL="0" distR="0" wp14:anchorId="46010773" wp14:editId="4F978316">
-            <wp:extent cx="5756910" cy="3225800"/>
-            <wp:effectExtent l="0" t="0" r="0" b="0"/>
+          <wp:inline distT="0" distB="0" distL="0" distR="0" wp14:anchorId="46010773" wp14:editId="76096351">
+            <wp:extent cx="5593278" cy="2123361"/>
+            <wp:effectExtent l="0" t="0" r="7620" b="0"/>
             <wp:docPr id="626413200" name="Obraz 3"/>
             <wp:cNvGraphicFramePr>
               <a:graphicFrameLocks xmlns:a="http://schemas.openxmlformats.org/drawingml/2006/main" noChangeAspect="1"/>
@@ -1883,15 +1860,15 @@
                       <a:picLocks noChangeAspect="1" noChangeArrowheads="1"/>
                     </pic:cNvPicPr>
                   </pic:nvPicPr>
-                  <pic:blipFill>
-                    <a:blip r:embed="rId9" cstate="print">
+                  <pic:blipFill rotWithShape="1">
+                    <a:blip r:embed="rId11" cstate="print">
                       <a:extLst>
                         <a:ext uri="{28A0092B-C50C-407E-A947-70E740481C1C}">
                           <a14:useLocalDpi xmlns:a14="http://schemas.microsoft.com/office/drawing/2010/main" val="0"/>
                         </a:ext>
                       </a:extLst>
                     </a:blip>
-                    <a:srcRect/>
+                    <a:srcRect t="12148" b="20102"/>
                     <a:stretch>
                       <a:fillRect/>
                     </a:stretch>
@@ -1899,7 +1876,7 @@
                   <pic:spPr bwMode="auto">
                     <a:xfrm>
                       <a:off x="0" y="0"/>
-                      <a:ext cx="5756910" cy="3225800"/>
+                      <a:ext cx="5599146" cy="2125589"/>
                     </a:xfrm>
                     <a:prstGeom prst="rect">
                       <a:avLst/>
@@ -1908,6 +1885,11 @@
                     <a:ln>
                       <a:noFill/>
                     </a:ln>
+                    <a:extLst>
+                      <a:ext uri="{53640926-AAD7-44D8-BBD7-CCE9431645EC}">
+                        <a14:shadowObscured xmlns:a14="http://schemas.microsoft.com/office/drawing/2010/main"/>
+                      </a:ext>
+                    </a:extLst>
                   </pic:spPr>
                 </pic:pic>
               </a:graphicData>
@@ -1915,8 +1897,6 @@
           </wp:inline>
         </w:drawing>
       </w:r>
-    </w:p>
-    <w:p>
       <w:r>
         <w:br w:type="page"/>
       </w:r>
@@ -1932,7 +1912,7 @@
       </w:pPr>
       <w:r>
         <w:lastRenderedPageBreak/>
-        <w:t>Regiony – tabela przedstawia wartość sprzedaży towarów netto w regionach do których występowała sprzedaż w bieżącym miesiącu.</w:t>
+        <w:t>Regiony – tabela przedstawia wartość sprzedaży towarów netto w regionach do których występowała sprzedaż.</w:t>
       </w:r>
     </w:p>
     <w:p>
@@ -1960,11 +1940,20 @@
     <w:p>
       <w:pPr>
         <w:pStyle w:val="Akapitzlist"/>
-        <w:ind w:left="360"/>
-        <w:jc w:val="both"/>
-      </w:pPr>
-      <w:r>
-        <w:t>Domyślnie klienci posortowani są malejąco po wartości sprzedaży netto</w:t>
+        <w:numPr>
+          <w:ilvl w:val="0"/>
+          <w:numId w:val="5"/>
+        </w:numPr>
+        <w:jc w:val="both"/>
+      </w:pPr>
+      <w:r>
+        <w:t xml:space="preserve">Marka – tabela przedstawia sprzedaż netto </w:t>
+      </w:r>
+      <w:r>
+        <w:t>towarów oraz udzielony średni rabat dla towarów poszczególnych mare</w:t>
+      </w:r>
+      <w:r>
+        <w:t>k</w:t>
       </w:r>
       <w:r>
         <w:t>.</w:t>
@@ -1980,119 +1969,25 @@
         <w:jc w:val="both"/>
       </w:pPr>
       <w:r>
-        <w:t xml:space="preserve">Marka – tabela przedstawia sprzedaż netto </w:t>
-      </w:r>
-      <w:r>
-        <w:t>towarów oraz udzielony średni rabat dla towarów poszczególnych marek w okresie czasu wybranego na filtrze dat (13).</w:t>
-      </w:r>
-    </w:p>
-    <w:p>
-      <w:pPr>
-        <w:pStyle w:val="Akapitzlist"/>
-        <w:ind w:left="360"/>
-        <w:jc w:val="both"/>
-      </w:pPr>
-      <w:r>
-        <w:t>Domyślnie marki posortowane są malejąco po wartości sprzedaży netto</w:t>
+        <w:t xml:space="preserve">Grupa produktowa - tabela przedstawia sprzedaż netto towarów, </w:t>
+      </w:r>
+      <w:r>
+        <w:t xml:space="preserve">ilość sztuk, </w:t>
+      </w:r>
+      <w:r>
+        <w:t xml:space="preserve">udzielony średni rabat oraz </w:t>
+      </w:r>
+      <w:r>
+        <w:t xml:space="preserve">marże uzyskaną </w:t>
+      </w:r>
+      <w:r>
+        <w:t>dla danej grupy</w:t>
       </w:r>
       <w:r>
         <w:t>.</w:t>
       </w:r>
     </w:p>
     <w:p>
-      <w:pPr>
-        <w:pStyle w:val="Akapitzlist"/>
-        <w:numPr>
-          <w:ilvl w:val="0"/>
-          <w:numId w:val="5"/>
-        </w:numPr>
-        <w:jc w:val="both"/>
-      </w:pPr>
-      <w:r>
-        <w:t>Grupa produktowa - tabela przedstawia sprzedaż netto towarów, udzielony średni rabat oraz ilość sprzedanych sztuk dla danej grupy produktowej</w:t>
-      </w:r>
-      <w:r>
-        <w:t xml:space="preserve"> w okresie czasu wybranego na filtrze dat (13).</w:t>
-      </w:r>
-    </w:p>
-    <w:p>
-      <w:pPr>
-        <w:pStyle w:val="Akapitzlist"/>
-        <w:ind w:left="360"/>
-        <w:jc w:val="both"/>
-      </w:pPr>
-      <w:r>
-        <w:t>Domyślnie grupy produktowe posortowane są malejąco po wartości sprzedaży netto.</w:t>
-      </w:r>
-    </w:p>
-    <w:p>
-      <w:pPr>
-        <w:pStyle w:val="Akapitzlist"/>
-        <w:numPr>
-          <w:ilvl w:val="0"/>
-          <w:numId w:val="5"/>
-        </w:numPr>
-        <w:jc w:val="both"/>
-      </w:pPr>
-      <w:r>
-        <w:t>Panel nawigacyjny służący do przechodzenia do innych zakładek raportu. Po najechaniu kursorem myszy na ikonę wyświetla się podpowiedź docelowej strony.</w:t>
-      </w:r>
-    </w:p>
-    <w:p>
-      <w:pPr>
-        <w:pStyle w:val="Akapitzlist"/>
-        <w:numPr>
-          <w:ilvl w:val="0"/>
-          <w:numId w:val="5"/>
-        </w:numPr>
-        <w:jc w:val="both"/>
-      </w:pPr>
-      <w:r>
-        <w:t xml:space="preserve">Panel do wyboru handlowca dla którego wyświetlane są dane w raporcie. </w:t>
-      </w:r>
-    </w:p>
-    <w:p>
-      <w:pPr>
-        <w:pStyle w:val="Akapitzlist"/>
-        <w:numPr>
-          <w:ilvl w:val="0"/>
-          <w:numId w:val="5"/>
-        </w:numPr>
-        <w:jc w:val="both"/>
-      </w:pPr>
-      <w:r>
-        <w:t xml:space="preserve">Filtr dat służący do wyboru roku oraz miesiąca dla którego wyświetlane są dane na wizualizacji. </w:t>
-      </w:r>
-    </w:p>
-    <w:p>
-      <w:pPr>
-        <w:pStyle w:val="Akapitzlist"/>
-        <w:ind w:left="360"/>
-        <w:jc w:val="both"/>
-      </w:pPr>
-      <w:r>
-        <w:t>Po przytrzymaniu klawisza „</w:t>
-      </w:r>
-      <w:proofErr w:type="spellStart"/>
-      <w:r>
-        <w:t>ctrl</w:t>
-      </w:r>
-      <w:proofErr w:type="spellEnd"/>
-      <w:r>
-        <w:t>„ na klawiaturze możliwe jest wybranie kilku miesięcy lub lat.</w:t>
-      </w:r>
-    </w:p>
-    <w:p>
-      <w:pPr>
-        <w:pStyle w:val="Akapitzlist"/>
-        <w:ind w:left="360"/>
-        <w:jc w:val="both"/>
-      </w:pPr>
-      <w:r>
-        <w:t>Wybrane daty wpływają na dane wyświetlane również na stronach Klienci, Faktury, Regiony i typy urządzeń.</w:t>
-      </w:r>
-    </w:p>
-    <w:p>
       <w:r>
         <w:br w:type="page"/>
       </w:r>
@@ -2102,965 +1997,25 @@
         <w:pStyle w:val="Nagwek2"/>
         <w:jc w:val="both"/>
       </w:pPr>
-      <w:bookmarkStart w:id="2" w:name="_Toc202765168"/>
-      <w:r>
-        <w:lastRenderedPageBreak/>
-        <w:t>Klienci</w:t>
-      </w:r>
-      <w:bookmarkEnd w:id="2"/>
-    </w:p>
-    <w:p>
+      <w:bookmarkStart w:id="2" w:name="_Toc205276324"/>
       <w:r>
         <w:rPr>
           <w:noProof/>
         </w:rPr>
+        <w:lastRenderedPageBreak/>
         <w:drawing>
-          <wp:anchor distT="0" distB="0" distL="114300" distR="114300" simplePos="0" relativeHeight="251658240" behindDoc="0" locked="0" layoutInCell="1" allowOverlap="1" wp14:anchorId="6B5906A3" wp14:editId="64CE9E54">
+          <wp:anchor distT="0" distB="0" distL="114300" distR="114300" simplePos="0" relativeHeight="251668480" behindDoc="0" locked="0" layoutInCell="1" allowOverlap="1" wp14:anchorId="3E474B83" wp14:editId="1C889F99">
             <wp:simplePos x="0" y="0"/>
             <wp:positionH relativeFrom="margin">
               <wp:align>center</wp:align>
             </wp:positionH>
             <wp:positionV relativeFrom="paragraph">
-              <wp:posOffset>252984</wp:posOffset>
+              <wp:posOffset>385527</wp:posOffset>
             </wp:positionV>
-            <wp:extent cx="7105902" cy="3960000"/>
-            <wp:effectExtent l="0" t="0" r="0" b="2540"/>
+            <wp:extent cx="6840000" cy="3797988"/>
+            <wp:effectExtent l="0" t="0" r="0" b="0"/>
             <wp:wrapSquare wrapText="bothSides"/>
-            <wp:docPr id="1631163161" name="Obraz 4" descr="Obraz zawierający tekst, zrzut ekranu, numer, diagram&#10;&#10;Zawartość wygenerowana przez AI może być niepoprawna."/>
-            <wp:cNvGraphicFramePr>
-              <a:graphicFrameLocks xmlns:a="http://schemas.openxmlformats.org/drawingml/2006/main" noChangeAspect="1"/>
-            </wp:cNvGraphicFramePr>
-            <a:graphic xmlns:a="http://schemas.openxmlformats.org/drawingml/2006/main">
-              <a:graphicData uri="http://schemas.openxmlformats.org/drawingml/2006/picture">
-                <pic:pic xmlns:pic="http://schemas.openxmlformats.org/drawingml/2006/picture">
-                  <pic:nvPicPr>
-                    <pic:cNvPr id="1631163161" name="Obraz 4" descr="Obraz zawierający tekst, zrzut ekranu, numer, diagram&#10;&#10;Zawartość wygenerowana przez AI może być niepoprawna."/>
-                    <pic:cNvPicPr>
-                      <a:picLocks noChangeAspect="1" noChangeArrowheads="1"/>
-                    </pic:cNvPicPr>
-                  </pic:nvPicPr>
-                  <pic:blipFill>
-                    <a:blip r:embed="rId10">
-                      <a:extLst>
-                        <a:ext uri="{28A0092B-C50C-407E-A947-70E740481C1C}">
-                          <a14:useLocalDpi xmlns:a14="http://schemas.microsoft.com/office/drawing/2010/main" val="0"/>
-                        </a:ext>
-                      </a:extLst>
-                    </a:blip>
-                    <a:srcRect/>
-                    <a:stretch>
-                      <a:fillRect/>
-                    </a:stretch>
-                  </pic:blipFill>
-                  <pic:spPr bwMode="auto">
-                    <a:xfrm>
-                      <a:off x="0" y="0"/>
-                      <a:ext cx="7105902" cy="3960000"/>
-                    </a:xfrm>
-                    <a:prstGeom prst="rect">
-                      <a:avLst/>
-                    </a:prstGeom>
-                    <a:noFill/>
-                    <a:ln>
-                      <a:noFill/>
-                    </a:ln>
-                  </pic:spPr>
-                </pic:pic>
-              </a:graphicData>
-            </a:graphic>
-            <wp14:sizeRelH relativeFrom="page">
-              <wp14:pctWidth>0</wp14:pctWidth>
-            </wp14:sizeRelH>
-            <wp14:sizeRelV relativeFrom="page">
-              <wp14:pctHeight>0</wp14:pctHeight>
-            </wp14:sizeRelV>
-          </wp:anchor>
-        </w:drawing>
-      </w:r>
-    </w:p>
-    <w:p/>
-    <w:p>
-      <w:r>
-        <w:t>Strona przedstawia informacje o kliencie oraz wartość jego zakupu.</w:t>
-      </w:r>
-    </w:p>
-    <w:p/>
-    <w:p>
-      <w:r>
-        <w:t>Opis wizualizacji:</w:t>
-      </w:r>
-    </w:p>
-    <w:p>
-      <w:pPr>
-        <w:pStyle w:val="Akapitzlist"/>
-        <w:numPr>
-          <w:ilvl w:val="0"/>
-          <w:numId w:val="6"/>
-        </w:numPr>
-        <w:jc w:val="both"/>
-      </w:pPr>
-      <w:r>
-        <w:t>Nazwa klienta - filtr pozwalający na wybór</w:t>
-      </w:r>
-      <w:r>
-        <w:t xml:space="preserve"> nazwy</w:t>
-      </w:r>
-      <w:r>
-        <w:t xml:space="preserve"> klienta dla klienta którego mają być wyświetlan</w:t>
-      </w:r>
-      <w:r>
-        <w:t>e dane.</w:t>
-      </w:r>
-    </w:p>
-    <w:p>
-      <w:pPr>
-        <w:pStyle w:val="Akapitzlist"/>
-        <w:ind w:left="360"/>
-        <w:jc w:val="both"/>
-      </w:pPr>
-      <w:r>
-        <w:t xml:space="preserve">Filtr wpływa </w:t>
-      </w:r>
-      <w:r>
-        <w:t xml:space="preserve">również </w:t>
-      </w:r>
-      <w:r>
-        <w:t xml:space="preserve">na </w:t>
-      </w:r>
-      <w:r>
-        <w:t>stronę raportu „Faktury”.</w:t>
-      </w:r>
-    </w:p>
-    <w:p>
-      <w:pPr>
-        <w:pStyle w:val="Akapitzlist"/>
-        <w:numPr>
-          <w:ilvl w:val="0"/>
-          <w:numId w:val="6"/>
-        </w:numPr>
-        <w:jc w:val="both"/>
-      </w:pPr>
-      <w:r>
-        <w:t>Profil klienta – filtr pozwalający na wybór profilu klienta dla którego mają być wyświetlane dane.</w:t>
-      </w:r>
-    </w:p>
-    <w:p>
-      <w:pPr>
-        <w:pStyle w:val="Akapitzlist"/>
-        <w:ind w:left="360"/>
-        <w:jc w:val="both"/>
-      </w:pPr>
-      <w:r>
-        <w:t>Filtr wpływa również na stronę raportu „Faktury”.</w:t>
-      </w:r>
-    </w:p>
-    <w:p>
-      <w:pPr>
-        <w:pStyle w:val="Akapitzlist"/>
-        <w:numPr>
-          <w:ilvl w:val="0"/>
-          <w:numId w:val="6"/>
-        </w:numPr>
-        <w:jc w:val="both"/>
-      </w:pPr>
-      <w:r>
-        <w:t>Region – filtr pozwalający na wybór regionu dla którego mają być wyświetlane dane.</w:t>
-      </w:r>
-    </w:p>
-    <w:p>
-      <w:pPr>
-        <w:pStyle w:val="Akapitzlist"/>
-        <w:ind w:left="360"/>
-        <w:jc w:val="both"/>
-      </w:pPr>
-      <w:r>
-        <w:t>Filtr wpływa również na stronę raportu „Faktury”.</w:t>
-      </w:r>
-    </w:p>
-    <w:p>
-      <w:pPr>
-        <w:pStyle w:val="Akapitzlist"/>
-        <w:numPr>
-          <w:ilvl w:val="0"/>
-          <w:numId w:val="6"/>
-        </w:numPr>
-        <w:jc w:val="both"/>
-      </w:pPr>
-      <w:r>
-        <w:t>Sprzedaż całkowita netto –</w:t>
-      </w:r>
-      <w:r>
-        <w:t xml:space="preserve"> przedstawia </w:t>
-      </w:r>
-      <w:r>
-        <w:t>wartość sprzedaży dla klienta</w:t>
-      </w:r>
-      <w:r>
-        <w:t xml:space="preserve">, grupy klientów o wybranym profilu lub danego regionu wybranych za </w:t>
-      </w:r>
-      <w:r>
-        <w:t>pomocą filtrów.</w:t>
-      </w:r>
-    </w:p>
-    <w:p>
-      <w:pPr>
-        <w:pStyle w:val="Akapitzlist"/>
-        <w:numPr>
-          <w:ilvl w:val="0"/>
-          <w:numId w:val="6"/>
-        </w:numPr>
-        <w:jc w:val="both"/>
-      </w:pPr>
-      <w:r>
-        <w:t xml:space="preserve">Średni rabat </w:t>
-      </w:r>
-      <w:r>
-        <w:t>–</w:t>
-      </w:r>
-      <w:r>
-        <w:t xml:space="preserve"> </w:t>
-      </w:r>
-      <w:r>
-        <w:t>przedstawia średni rabat udzielony dla klienta, grupy klientów o wybranym profilu lub danego regionu wybranych za pomocą filtrów.</w:t>
-      </w:r>
-    </w:p>
-    <w:p>
-      <w:pPr>
-        <w:pStyle w:val="Akapitzlist"/>
-        <w:numPr>
-          <w:ilvl w:val="0"/>
-          <w:numId w:val="6"/>
-        </w:numPr>
-        <w:jc w:val="both"/>
-      </w:pPr>
-      <w:r>
-        <w:lastRenderedPageBreak/>
-        <w:t xml:space="preserve">Otwarte płatności brutto – przedstawia </w:t>
-      </w:r>
-      <w:r>
-        <w:t>wartość brutto wszystkich nieopłaconych faktur zarówno przed terminem płatności jak i po terminie płatności dla klienta, grupy klientów o wybranym profilu lub danego regionu wybranych za pomocą filtrów.</w:t>
-      </w:r>
-    </w:p>
-    <w:p>
-      <w:pPr>
-        <w:pStyle w:val="Akapitzlist"/>
-        <w:numPr>
-          <w:ilvl w:val="0"/>
-          <w:numId w:val="6"/>
-        </w:numPr>
-        <w:jc w:val="both"/>
-      </w:pPr>
-      <w:r>
-        <w:rPr>
-          <w:noProof/>
-        </w:rPr>
-        <w:t>Przeterminowane płatności brutto - przedstawia wartość brutto wszystkich nieopłaconych</w:t>
-      </w:r>
-      <w:r>
-        <w:t xml:space="preserve"> faktur po terminie płatności dla klienta, grupy klientów o wybranym profilu lub danego regionu wybranych za pomocą filtrów.</w:t>
-      </w:r>
-    </w:p>
-    <w:p>
-      <w:pPr>
-        <w:pStyle w:val="Akapitzlist"/>
-        <w:numPr>
-          <w:ilvl w:val="0"/>
-          <w:numId w:val="6"/>
-        </w:numPr>
-        <w:jc w:val="both"/>
-      </w:pPr>
-      <w:r>
-        <w:t>Ilość otwartych faktur – przedstawia ilość wszystkich nieopłaconych faktur zarówno przed terminem płatności jak i po terminie płatności dla klienta, grupy klientów o wybranym profilu lub danego regionu wybranych za pomocą filtrów.</w:t>
-      </w:r>
-    </w:p>
-    <w:p>
-      <w:pPr>
-        <w:pStyle w:val="Akapitzlist"/>
-        <w:numPr>
-          <w:ilvl w:val="0"/>
-          <w:numId w:val="6"/>
-        </w:numPr>
-        <w:jc w:val="both"/>
-      </w:pPr>
-      <w:r>
-        <w:rPr>
-          <w:noProof/>
-        </w:rPr>
-        <w:t>Przeterminowane płatności brutto - przedstawia ilość wszystkich nieopłaconych</w:t>
-      </w:r>
-      <w:r>
-        <w:t xml:space="preserve"> faktur po terminie płatności dla klienta, grupy klientów o wybranym profilu lub danego regionu wybranych za pomocą filtrów.</w:t>
-      </w:r>
-    </w:p>
-    <w:p>
-      <w:pPr>
-        <w:pStyle w:val="Akapitzlist"/>
-        <w:numPr>
-          <w:ilvl w:val="0"/>
-          <w:numId w:val="6"/>
-        </w:numPr>
-        <w:jc w:val="both"/>
-      </w:pPr>
-      <w:r>
-        <w:t>Zakup netto bieżący rok – przedstawia zakup netto w bieżącym roku płatności dla klienta, grupy klientów o wybranym profilu lub danego regionu wybranych za pomocą filtrów.</w:t>
-      </w:r>
-    </w:p>
-    <w:p>
-      <w:pPr>
-        <w:pStyle w:val="Akapitzlist"/>
-        <w:numPr>
-          <w:ilvl w:val="0"/>
-          <w:numId w:val="6"/>
-        </w:numPr>
-        <w:jc w:val="both"/>
-      </w:pPr>
-      <w:r>
-        <w:t>Wykres przedstawia wartość sprzedaży w czasie dla klienta, grupy klientów o wybranym profilu lub danego regionu wybranych za pomocą filtrów.</w:t>
-      </w:r>
-    </w:p>
-    <w:p>
-      <w:pPr>
-        <w:pStyle w:val="Akapitzlist"/>
-        <w:ind w:left="360"/>
-        <w:jc w:val="both"/>
-      </w:pPr>
-      <w:r>
-        <w:t>Po wybraniu tylko roku  w pasku wyboru dat (19) widoczna jest sprzedaż w poszczególnych miesiącach wybranego roku.</w:t>
-      </w:r>
-    </w:p>
-    <w:p>
-      <w:pPr>
-        <w:pStyle w:val="Akapitzlist"/>
-        <w:ind w:left="360"/>
-        <w:jc w:val="both"/>
-      </w:pPr>
-      <w:r>
-        <w:t>Po wybraniu tylko miesiąca w pasku wyboru dat (19) widoczna jest wartość sprzedaży towarów netto w analogicznych miesiącach poprzednich lat.</w:t>
-      </w:r>
-    </w:p>
-    <w:p>
-      <w:pPr>
-        <w:pStyle w:val="Akapitzlist"/>
-        <w:numPr>
-          <w:ilvl w:val="0"/>
-          <w:numId w:val="6"/>
-        </w:numPr>
-        <w:jc w:val="both"/>
-      </w:pPr>
-      <w:r>
-        <w:t>Marka – tabela przedstawia sprzedaż netto towarów oraz udzielony średni rabat dla towarów poszczególnych marek dla klienta, grupy klientów o wybranym profilu lub danego regionu wybranych za pomocą filtrów w okresie czasu wybranego na filtrze dat (13).</w:t>
-      </w:r>
-    </w:p>
-    <w:p>
-      <w:pPr>
-        <w:pStyle w:val="Akapitzlist"/>
-        <w:ind w:left="360"/>
-        <w:jc w:val="both"/>
-      </w:pPr>
-      <w:r>
-        <w:t>Domyślnie marki posortowane są malejąco po wartości sprzedaży netto.</w:t>
-      </w:r>
-    </w:p>
-    <w:p>
-      <w:pPr>
-        <w:pStyle w:val="Akapitzlist"/>
-        <w:numPr>
-          <w:ilvl w:val="0"/>
-          <w:numId w:val="6"/>
-        </w:numPr>
-        <w:jc w:val="both"/>
-      </w:pPr>
-      <w:r>
-        <w:t>Grupa produktowa - tabela przedstawia sprzedaż netto towarów, udzielony średni rabat oraz ilość sprzedanych sztuk dla danej grupy produktowej dla klienta, grupy klientów o wybranym profilu lub danego regionu wybranych za pomocą filtrów. w okresie czasu wybranego na filtrze dat (19).</w:t>
-      </w:r>
-    </w:p>
-    <w:p>
-      <w:pPr>
-        <w:pStyle w:val="Akapitzlist"/>
-        <w:ind w:left="360"/>
-        <w:jc w:val="both"/>
-      </w:pPr>
-      <w:r>
-        <w:t>Domyślnie grupy produktowe posortowane są malejąco po wartości sprzedaży netto.</w:t>
-      </w:r>
-    </w:p>
-    <w:p>
-      <w:pPr>
-        <w:pStyle w:val="Akapitzlist"/>
-        <w:numPr>
-          <w:ilvl w:val="0"/>
-          <w:numId w:val="6"/>
-        </w:numPr>
-        <w:jc w:val="both"/>
-      </w:pPr>
-      <w:r>
-        <w:t xml:space="preserve"> i 15. Podstawowe informacje o kliencie.</w:t>
-      </w:r>
-    </w:p>
-    <w:p>
-      <w:pPr>
-        <w:pStyle w:val="Akapitzlist"/>
-        <w:numPr>
-          <w:ilvl w:val="0"/>
-          <w:numId w:val="7"/>
-        </w:numPr>
-        <w:jc w:val="both"/>
-      </w:pPr>
-      <w:r>
-        <w:t>Informacja o limicie kredytowym oraz wykorzystanym limicie.</w:t>
-      </w:r>
-    </w:p>
-    <w:p>
-      <w:pPr>
-        <w:pStyle w:val="Akapitzlist"/>
-        <w:numPr>
-          <w:ilvl w:val="0"/>
-          <w:numId w:val="7"/>
-        </w:numPr>
-        <w:jc w:val="both"/>
-      </w:pPr>
-      <w:r>
-        <w:t>Panel nawigacyjny służący do przechodzenia do innych zakładek raportu. Po najechaniu kursorem myszy na ikonę wyświetla się podpowiedź docelowej strony.</w:t>
-      </w:r>
-    </w:p>
-    <w:p>
-      <w:pPr>
-        <w:pStyle w:val="Akapitzlist"/>
-        <w:numPr>
-          <w:ilvl w:val="0"/>
-          <w:numId w:val="7"/>
-        </w:numPr>
-        <w:jc w:val="both"/>
-      </w:pPr>
-      <w:r>
-        <w:t xml:space="preserve">Panel do wyboru handlowca dla którego wyświetlane są dane w raporcie. </w:t>
-      </w:r>
-    </w:p>
-    <w:p>
-      <w:pPr>
-        <w:pStyle w:val="Akapitzlist"/>
-        <w:numPr>
-          <w:ilvl w:val="0"/>
-          <w:numId w:val="7"/>
-        </w:numPr>
-        <w:jc w:val="both"/>
-      </w:pPr>
-      <w:r>
-        <w:lastRenderedPageBreak/>
-        <w:t xml:space="preserve">Filtr dat służący do wyboru roku oraz miesiąca dla którego wyświetlane są dane na wizualizacji. </w:t>
-      </w:r>
-    </w:p>
-    <w:p>
-      <w:pPr>
-        <w:pStyle w:val="Akapitzlist"/>
-        <w:ind w:left="360"/>
-        <w:jc w:val="both"/>
-      </w:pPr>
-      <w:r>
-        <w:t>Po przytrzymaniu klawisza „</w:t>
-      </w:r>
-      <w:proofErr w:type="spellStart"/>
-      <w:r>
-        <w:t>ctrl</w:t>
-      </w:r>
-      <w:proofErr w:type="spellEnd"/>
-      <w:r>
-        <w:t>„ na klawiaturze możliwe jest wybranie kilku miesięcy lub lat.</w:t>
-      </w:r>
-    </w:p>
-    <w:p>
-      <w:pPr>
-        <w:pStyle w:val="Akapitzlist"/>
-        <w:ind w:left="360"/>
-        <w:jc w:val="both"/>
-      </w:pPr>
-      <w:r>
-        <w:t>Wybrane daty wpływają na dane wyświetlane również na stronach Klienci, Faktury, Regiony i typy urządzeń.</w:t>
-      </w:r>
-    </w:p>
-    <w:p>
-      <w:r>
-        <w:br w:type="page"/>
-      </w:r>
-    </w:p>
-    <w:p>
-      <w:pPr>
-        <w:pStyle w:val="Nagwek2"/>
-      </w:pPr>
-      <w:bookmarkStart w:id="3" w:name="_Faktury"/>
-      <w:bookmarkStart w:id="4" w:name="_Toc202765169"/>
-      <w:bookmarkEnd w:id="3"/>
-      <w:r>
-        <w:lastRenderedPageBreak/>
-        <w:t>Faktur</w:t>
-      </w:r>
-      <w:r>
-        <w:t>y</w:t>
-      </w:r>
-      <w:bookmarkEnd w:id="4"/>
-    </w:p>
-    <w:p>
-      <w:r>
-        <w:rPr>
-          <w:noProof/>
-        </w:rPr>
-        <w:drawing>
-          <wp:anchor distT="0" distB="0" distL="114300" distR="114300" simplePos="0" relativeHeight="251661312" behindDoc="0" locked="0" layoutInCell="1" allowOverlap="1" wp14:anchorId="091551CD" wp14:editId="67C7B8B3">
-            <wp:simplePos x="0" y="0"/>
-            <wp:positionH relativeFrom="margin">
-              <wp:align>center</wp:align>
-            </wp:positionH>
-            <wp:positionV relativeFrom="paragraph">
-              <wp:posOffset>268833</wp:posOffset>
-            </wp:positionV>
-            <wp:extent cx="7010323" cy="3960000"/>
-            <wp:effectExtent l="0" t="0" r="635" b="2540"/>
-            <wp:wrapSquare wrapText="bothSides"/>
-            <wp:docPr id="646537149" name="Obraz 4"/>
-            <wp:cNvGraphicFramePr>
-              <a:graphicFrameLocks xmlns:a="http://schemas.openxmlformats.org/drawingml/2006/main" noChangeAspect="1"/>
-            </wp:cNvGraphicFramePr>
-            <a:graphic xmlns:a="http://schemas.openxmlformats.org/drawingml/2006/main">
-              <a:graphicData uri="http://schemas.openxmlformats.org/drawingml/2006/picture">
-                <pic:pic xmlns:pic="http://schemas.openxmlformats.org/drawingml/2006/picture">
-                  <pic:nvPicPr>
-                    <pic:cNvPr id="0" name="Picture 4"/>
-                    <pic:cNvPicPr>
-                      <a:picLocks noChangeAspect="1" noChangeArrowheads="1"/>
-                    </pic:cNvPicPr>
-                  </pic:nvPicPr>
-                  <pic:blipFill>
-                    <a:blip r:embed="rId11">
-                      <a:extLst>
-                        <a:ext uri="{28A0092B-C50C-407E-A947-70E740481C1C}">
-                          <a14:useLocalDpi xmlns:a14="http://schemas.microsoft.com/office/drawing/2010/main" val="0"/>
-                        </a:ext>
-                      </a:extLst>
-                    </a:blip>
-                    <a:srcRect/>
-                    <a:stretch>
-                      <a:fillRect/>
-                    </a:stretch>
-                  </pic:blipFill>
-                  <pic:spPr bwMode="auto">
-                    <a:xfrm>
-                      <a:off x="0" y="0"/>
-                      <a:ext cx="7010323" cy="3960000"/>
-                    </a:xfrm>
-                    <a:prstGeom prst="rect">
-                      <a:avLst/>
-                    </a:prstGeom>
-                    <a:noFill/>
-                    <a:ln>
-                      <a:noFill/>
-                    </a:ln>
-                  </pic:spPr>
-                </pic:pic>
-              </a:graphicData>
-            </a:graphic>
-            <wp14:sizeRelH relativeFrom="page">
-              <wp14:pctWidth>0</wp14:pctWidth>
-            </wp14:sizeRelH>
-            <wp14:sizeRelV relativeFrom="page">
-              <wp14:pctHeight>0</wp14:pctHeight>
-            </wp14:sizeRelV>
-          </wp:anchor>
-        </w:drawing>
-      </w:r>
-    </w:p>
-    <w:p>
-      <w:pPr>
-        <w:pStyle w:val="Akapitzlist"/>
-        <w:ind w:left="360"/>
-        <w:jc w:val="both"/>
-      </w:pPr>
-    </w:p>
-    <w:p>
-      <w:pPr>
-        <w:jc w:val="both"/>
-      </w:pPr>
-      <w:r>
-        <w:t>Strona przedstawia informacje o fakturach i ich szczegółach.</w:t>
-      </w:r>
-    </w:p>
-    <w:p>
-      <w:pPr>
-        <w:pStyle w:val="Akapitzlist"/>
-        <w:ind w:left="360"/>
-        <w:jc w:val="both"/>
-      </w:pPr>
-    </w:p>
-    <w:p>
-      <w:r>
-        <w:t>Opis wizualizacji:</w:t>
-      </w:r>
-    </w:p>
-    <w:p>
-      <w:pPr>
-        <w:pStyle w:val="Akapitzlist"/>
-        <w:numPr>
-          <w:ilvl w:val="0"/>
-          <w:numId w:val="8"/>
-        </w:numPr>
-        <w:jc w:val="both"/>
-      </w:pPr>
-      <w:r>
-        <w:t>Nazwa klienta - filtr pozwalający na wybór nazwy klienta dla klienta którego mają być wyświetlane dane.</w:t>
-      </w:r>
-    </w:p>
-    <w:p>
-      <w:pPr>
-        <w:pStyle w:val="Akapitzlist"/>
-        <w:ind w:left="360"/>
-        <w:jc w:val="both"/>
-      </w:pPr>
-      <w:r>
-        <w:t>Filtr wpływa również na stronę raportu „</w:t>
-      </w:r>
-      <w:r>
-        <w:t>Klienci</w:t>
-      </w:r>
-      <w:r>
-        <w:t>”</w:t>
-      </w:r>
-      <w:r>
-        <w:t xml:space="preserve"> oraz „Regiony i grupy towarów”</w:t>
-      </w:r>
-    </w:p>
-    <w:p>
-      <w:pPr>
-        <w:pStyle w:val="Akapitzlist"/>
-        <w:numPr>
-          <w:ilvl w:val="0"/>
-          <w:numId w:val="8"/>
-        </w:numPr>
-        <w:jc w:val="both"/>
-      </w:pPr>
-      <w:r>
-        <w:t>Profil klienta – filtr pozwalający na wybór profilu klienta dla którego mają być wyświetlane dane.</w:t>
-      </w:r>
-    </w:p>
-    <w:p>
-      <w:pPr>
-        <w:pStyle w:val="Akapitzlist"/>
-        <w:ind w:left="360"/>
-        <w:jc w:val="both"/>
-      </w:pPr>
-      <w:r>
-        <w:t>Filtr wpływa również na stronę raportu „</w:t>
-      </w:r>
-      <w:r>
-        <w:t>Klienci</w:t>
-      </w:r>
-      <w:r>
-        <w:t>”.</w:t>
-      </w:r>
-    </w:p>
-    <w:p>
-      <w:pPr>
-        <w:pStyle w:val="Akapitzlist"/>
-        <w:numPr>
-          <w:ilvl w:val="0"/>
-          <w:numId w:val="8"/>
-        </w:numPr>
-        <w:jc w:val="both"/>
-      </w:pPr>
-      <w:r>
-        <w:t>Region – filtr pozwalający na wybór regionu dla którego mają być wyświetlane dane.</w:t>
-      </w:r>
-    </w:p>
-    <w:p>
-      <w:pPr>
-        <w:pStyle w:val="Akapitzlist"/>
-        <w:ind w:left="360"/>
-        <w:jc w:val="both"/>
-      </w:pPr>
-      <w:r>
-        <w:t>Filtr wpływa również na stronę raportu „</w:t>
-      </w:r>
-      <w:r>
-        <w:t>Klienci</w:t>
-      </w:r>
-      <w:r>
-        <w:t>”.</w:t>
-      </w:r>
-    </w:p>
-    <w:p>
-      <w:pPr>
-        <w:pStyle w:val="Akapitzlist"/>
-        <w:numPr>
-          <w:ilvl w:val="0"/>
-          <w:numId w:val="8"/>
-        </w:numPr>
-        <w:jc w:val="both"/>
-      </w:pPr>
-      <w:r>
-        <w:t>Nr faktury – filtr pozwalający na znajdowanie faktury o konkretnym numerze.</w:t>
-      </w:r>
-    </w:p>
-    <w:p>
-      <w:pPr>
-        <w:pStyle w:val="Akapitzlist"/>
-        <w:numPr>
-          <w:ilvl w:val="0"/>
-          <w:numId w:val="8"/>
-        </w:numPr>
-        <w:jc w:val="both"/>
-      </w:pPr>
-      <w:r>
-        <w:t>Otwarte płatności brutto – przedstawia wartość brutto wszystkich nieopłaconych faktur zarówno przed terminem płatności jak i po terminie płatności dla zastosowanych filtrów.</w:t>
-      </w:r>
-    </w:p>
-    <w:p>
-      <w:pPr>
-        <w:pStyle w:val="Akapitzlist"/>
-        <w:ind w:left="360"/>
-        <w:jc w:val="both"/>
-      </w:pPr>
-      <w:r>
-        <w:lastRenderedPageBreak/>
-        <w:t>Nie wpływają na nią zastosowane filtry dat (11).</w:t>
-      </w:r>
-    </w:p>
-    <w:p>
-      <w:pPr>
-        <w:pStyle w:val="Akapitzlist"/>
-        <w:numPr>
-          <w:ilvl w:val="0"/>
-          <w:numId w:val="8"/>
-        </w:numPr>
-        <w:jc w:val="both"/>
-      </w:pPr>
-      <w:r>
-        <w:rPr>
-          <w:noProof/>
-        </w:rPr>
-        <w:t>Przeterminowane płatności brutto - przedstawia wartość brutto wszystkich nieopłaconych</w:t>
-      </w:r>
-      <w:r>
-        <w:t xml:space="preserve"> faktur po terminie płatności dla zastosowanych filtrów.</w:t>
-      </w:r>
-    </w:p>
-    <w:p>
-      <w:pPr>
-        <w:pStyle w:val="Akapitzlist"/>
-        <w:ind w:left="360"/>
-        <w:jc w:val="both"/>
-      </w:pPr>
-      <w:r>
-        <w:t>Nie wpływają na nią zastosowane filtry dat (11).</w:t>
-      </w:r>
-    </w:p>
-    <w:p>
-      <w:pPr>
-        <w:pStyle w:val="Akapitzlist"/>
-        <w:numPr>
-          <w:ilvl w:val="0"/>
-          <w:numId w:val="8"/>
-        </w:numPr>
-        <w:jc w:val="both"/>
-      </w:pPr>
-      <w:r>
-        <w:t>Wykres przedstawiający ilość faktur opłaconych, przeterminowanych oraz nieopłaconych przed terminem płatności oraz ich udział procentowy w całkowitej ilości faktur.</w:t>
-      </w:r>
-    </w:p>
-    <w:p>
-      <w:pPr>
-        <w:pStyle w:val="Akapitzlist"/>
-        <w:numPr>
-          <w:ilvl w:val="0"/>
-          <w:numId w:val="8"/>
-        </w:numPr>
-        <w:jc w:val="both"/>
-      </w:pPr>
-      <w:r>
-        <w:t>Tabela przedstawiająca informacje dotyczące poszczególnych faktur.</w:t>
-      </w:r>
-    </w:p>
-    <w:p>
-      <w:pPr>
-        <w:pStyle w:val="Akapitzlist"/>
-        <w:ind w:left="360"/>
-        <w:jc w:val="both"/>
-      </w:pPr>
-      <w:r>
-        <w:t xml:space="preserve">Po kliknięciu w wiersz tabeli z konkretną fakturą </w:t>
-      </w:r>
-      <w:r>
-        <w:t>uaktywnia się możliwość przejścia do jej szczegółów za pomocą przycisku „Szczegóły faktury” (12).</w:t>
-      </w:r>
-    </w:p>
-    <w:p>
-      <w:pPr>
-        <w:pStyle w:val="Akapitzlist"/>
-        <w:ind w:left="360"/>
-        <w:jc w:val="both"/>
-      </w:pPr>
-      <w:r>
-        <w:t xml:space="preserve">Po kliknięciu raport przekierowuje do strony </w:t>
-      </w:r>
-      <w:hyperlink w:anchor="_Szczegóły_faktury" w:history="1">
-        <w:r>
-          <w:rPr>
-            <w:rStyle w:val="Hipercze"/>
-          </w:rPr>
-          <w:t>„Szczegóły faktury”</w:t>
-        </w:r>
-      </w:hyperlink>
-    </w:p>
-    <w:p>
-      <w:pPr>
-        <w:pStyle w:val="Akapitzlist"/>
-        <w:ind w:left="360"/>
-        <w:jc w:val="both"/>
-      </w:pPr>
-    </w:p>
-    <w:p>
-      <w:pPr>
-        <w:pStyle w:val="Akapitzlist"/>
-        <w:ind w:left="360"/>
-        <w:jc w:val="both"/>
-      </w:pPr>
-      <w:r>
-        <w:t>Faktury zaznaczone kolorem pomarańczowym oznaczają faktury których termin płatności przypada na mniej niż 7 dni od bieżącej daty.</w:t>
-      </w:r>
-    </w:p>
-    <w:p>
-      <w:pPr>
-        <w:pStyle w:val="Akapitzlist"/>
-        <w:ind w:left="360"/>
-        <w:jc w:val="both"/>
-      </w:pPr>
-      <w:r>
-        <w:t>Faktury zaznaczone kolorem czerwonym oznaczają faktury których termin płatności minął.</w:t>
-      </w:r>
-    </w:p>
-    <w:p>
-      <w:pPr>
-        <w:pStyle w:val="Akapitzlist"/>
-        <w:ind w:left="360"/>
-        <w:jc w:val="both"/>
-      </w:pPr>
-    </w:p>
-    <w:p>
-      <w:pPr>
-        <w:pStyle w:val="Akapitzlist"/>
-        <w:numPr>
-          <w:ilvl w:val="0"/>
-          <w:numId w:val="8"/>
-        </w:numPr>
-        <w:jc w:val="both"/>
-      </w:pPr>
-      <w:r>
-        <w:t>Panel nawigacyjny służący do przechodzenia do innych zakładek raportu. Po najechaniu kursorem myszy na ikonę wyświetla się podpowiedź docelowej strony.</w:t>
-      </w:r>
-    </w:p>
-    <w:p>
-      <w:pPr>
-        <w:pStyle w:val="Akapitzlist"/>
-        <w:numPr>
-          <w:ilvl w:val="0"/>
-          <w:numId w:val="8"/>
-        </w:numPr>
-        <w:jc w:val="both"/>
-      </w:pPr>
-      <w:r>
-        <w:t xml:space="preserve">Panel do wyboru handlowca dla którego wyświetlane są dane w raporcie. </w:t>
-      </w:r>
-    </w:p>
-    <w:p>
-      <w:pPr>
-        <w:pStyle w:val="Akapitzlist"/>
-        <w:numPr>
-          <w:ilvl w:val="0"/>
-          <w:numId w:val="8"/>
-        </w:numPr>
-        <w:jc w:val="both"/>
-      </w:pPr>
-      <w:r>
-        <w:t xml:space="preserve">Filtr dat służący do wyboru roku oraz miesiąca dla którego wyświetlane są dane na wizualizacji. </w:t>
-      </w:r>
-    </w:p>
-    <w:p>
-      <w:pPr>
-        <w:pStyle w:val="Akapitzlist"/>
-        <w:ind w:left="360"/>
-        <w:jc w:val="both"/>
-      </w:pPr>
-      <w:r>
-        <w:t>Po przytrzymaniu klawisza „</w:t>
-      </w:r>
-      <w:proofErr w:type="spellStart"/>
-      <w:r>
-        <w:t>ctrl</w:t>
-      </w:r>
-      <w:proofErr w:type="spellEnd"/>
-      <w:r>
-        <w:t>„ na klawiaturze możliwe jest wybranie kilku miesięcy lub lat.</w:t>
-      </w:r>
-    </w:p>
-    <w:p>
-      <w:pPr>
-        <w:pStyle w:val="Akapitzlist"/>
-        <w:ind w:left="360"/>
-        <w:jc w:val="both"/>
-      </w:pPr>
-      <w:r>
-        <w:t>Wybrane daty wpływają na dane wyświetlane również na stronach Klienci, Faktury, Regiony i typy urządzeń.</w:t>
-      </w:r>
-    </w:p>
-    <w:p>
-      <w:pPr>
-        <w:pStyle w:val="Akapitzlist"/>
-        <w:numPr>
-          <w:ilvl w:val="0"/>
-          <w:numId w:val="8"/>
-        </w:numPr>
-        <w:jc w:val="both"/>
-      </w:pPr>
-      <w:r>
-        <w:t>Przycisk przejścia do szczegółów faktury.</w:t>
-      </w:r>
-    </w:p>
-    <w:p>
-      <w:r>
-        <w:br w:type="page"/>
-      </w:r>
-    </w:p>
-    <w:p>
-      <w:pPr>
-        <w:pStyle w:val="Nagwek2"/>
-      </w:pPr>
-      <w:bookmarkStart w:id="5" w:name="_Szczegóły_faktury"/>
-      <w:bookmarkStart w:id="6" w:name="_Toc202765170"/>
-      <w:bookmarkEnd w:id="5"/>
-      <w:r>
-        <w:lastRenderedPageBreak/>
-        <w:t>Szczegóły faktury</w:t>
-      </w:r>
-      <w:bookmarkEnd w:id="6"/>
-    </w:p>
-    <w:p>
-      <w:pPr>
-        <w:jc w:val="both"/>
-      </w:pPr>
-      <w:r>
-        <w:rPr>
-          <w:noProof/>
-        </w:rPr>
-        <w:drawing>
-          <wp:anchor distT="0" distB="0" distL="114300" distR="114300" simplePos="0" relativeHeight="251662336" behindDoc="0" locked="0" layoutInCell="1" allowOverlap="1" wp14:anchorId="13B8C7CB" wp14:editId="3926D002">
-            <wp:simplePos x="0" y="0"/>
-            <wp:positionH relativeFrom="margin">
-              <wp:align>center</wp:align>
-            </wp:positionH>
-            <wp:positionV relativeFrom="paragraph">
-              <wp:posOffset>237987</wp:posOffset>
-            </wp:positionV>
-            <wp:extent cx="7009200" cy="3465943"/>
-            <wp:effectExtent l="0" t="0" r="1270" b="1270"/>
-            <wp:wrapSquare wrapText="bothSides"/>
-            <wp:docPr id="1448582025" name="Obraz 1"/>
+            <wp:docPr id="1966532614" name="Obraz 1"/>
             <wp:cNvGraphicFramePr>
               <a:graphicFrameLocks xmlns:a="http://schemas.openxmlformats.org/drawingml/2006/main" noChangeAspect="1"/>
             </wp:cNvGraphicFramePr>
@@ -3089,7 +2044,7 @@
                   <pic:spPr bwMode="auto">
                     <a:xfrm>
                       <a:off x="0" y="0"/>
-                      <a:ext cx="7009200" cy="3465943"/>
+                      <a:ext cx="6840000" cy="3797988"/>
                     </a:xfrm>
                     <a:prstGeom prst="rect">
                       <a:avLst/>
@@ -3111,6 +2066,992 @@
           </wp:anchor>
         </w:drawing>
       </w:r>
+      <w:r>
+        <w:t>Klienci</w:t>
+      </w:r>
+      <w:bookmarkEnd w:id="2"/>
+    </w:p>
+    <w:p/>
+    <w:p>
+      <w:r>
+        <w:t>Strona przedstawia informacje o kliencie oraz wartość jego zakupu.</w:t>
+      </w:r>
+    </w:p>
+    <w:p/>
+    <w:p>
+      <w:r>
+        <w:t>Opis wizualizacji:</w:t>
+      </w:r>
+    </w:p>
+    <w:p>
+      <w:pPr>
+        <w:pStyle w:val="Akapitzlist"/>
+        <w:numPr>
+          <w:ilvl w:val="0"/>
+          <w:numId w:val="6"/>
+        </w:numPr>
+        <w:jc w:val="both"/>
+      </w:pPr>
+      <w:r>
+        <w:t>Panel nawigacyjny służący do przechodzenia do innych zakładek raportu. Po najechaniu kursorem myszy na ikonę wyświetla się podpowiedź docelowej strony.</w:t>
+      </w:r>
+    </w:p>
+    <w:p>
+      <w:pPr>
+        <w:pStyle w:val="Akapitzlist"/>
+        <w:numPr>
+          <w:ilvl w:val="0"/>
+          <w:numId w:val="6"/>
+        </w:numPr>
+        <w:jc w:val="both"/>
+      </w:pPr>
+      <w:r>
+        <w:t xml:space="preserve">Panel do wyboru handlowca dla którego wyświetlane są dane w raporcie. </w:t>
+      </w:r>
+    </w:p>
+    <w:p>
+      <w:pPr>
+        <w:pStyle w:val="Akapitzlist"/>
+        <w:numPr>
+          <w:ilvl w:val="0"/>
+          <w:numId w:val="6"/>
+        </w:numPr>
+        <w:jc w:val="both"/>
+      </w:pPr>
+      <w:r>
+        <w:t xml:space="preserve">Filtr dat służący do wyboru roku oraz miesiąca dla którego wyświetlane są dane na wizualizacji. </w:t>
+      </w:r>
+    </w:p>
+    <w:p>
+      <w:pPr>
+        <w:pStyle w:val="Akapitzlist"/>
+        <w:numPr>
+          <w:ilvl w:val="0"/>
+          <w:numId w:val="6"/>
+        </w:numPr>
+        <w:jc w:val="both"/>
+      </w:pPr>
+      <w:r>
+        <w:t>Filtr spółki pozwala wyświetlić klientów w wybranej spółce.</w:t>
+      </w:r>
+    </w:p>
+    <w:p>
+      <w:pPr>
+        <w:pStyle w:val="Akapitzlist"/>
+        <w:numPr>
+          <w:ilvl w:val="0"/>
+          <w:numId w:val="6"/>
+        </w:numPr>
+        <w:jc w:val="both"/>
+      </w:pPr>
+      <w:r>
+        <w:t>Filtr firm powiązanych – pozwala odfiltrować klientów spółek powiązanych lub niepowiązanych.</w:t>
+      </w:r>
+    </w:p>
+    <w:p>
+      <w:pPr>
+        <w:pStyle w:val="Akapitzlist"/>
+        <w:numPr>
+          <w:ilvl w:val="0"/>
+          <w:numId w:val="6"/>
+        </w:numPr>
+        <w:jc w:val="both"/>
+      </w:pPr>
+      <w:r>
+        <w:t>Filtr nazwy klienta – pozwala odfiltrować klienta po nazwie firmy.</w:t>
+      </w:r>
+    </w:p>
+    <w:p>
+      <w:pPr>
+        <w:pStyle w:val="Akapitzlist"/>
+        <w:numPr>
+          <w:ilvl w:val="0"/>
+          <w:numId w:val="6"/>
+        </w:numPr>
+        <w:jc w:val="both"/>
+      </w:pPr>
+      <w:r>
+        <w:t>Filtr profilu klienta – pozwala odfiltrować klientów o określonym profilu.</w:t>
+      </w:r>
+    </w:p>
+    <w:p>
+      <w:pPr>
+        <w:pStyle w:val="Akapitzlist"/>
+        <w:numPr>
+          <w:ilvl w:val="0"/>
+          <w:numId w:val="6"/>
+        </w:numPr>
+        <w:jc w:val="both"/>
+      </w:pPr>
+      <w:r>
+        <w:t>Filtr Regionów – pozwala odfiltrować klientów w konkretnym regionie.</w:t>
+      </w:r>
+    </w:p>
+    <w:p>
+      <w:pPr>
+        <w:pStyle w:val="Akapitzlist"/>
+        <w:numPr>
+          <w:ilvl w:val="0"/>
+          <w:numId w:val="6"/>
+        </w:numPr>
+        <w:jc w:val="both"/>
+      </w:pPr>
+      <w:r>
+        <w:t>Wielkość sprzedaży ostatnie 12 mc – pokazuje w jakiej grupie sprzedaży w ciągu ostatnich 12 miesięcy znajduje się klient.</w:t>
+      </w:r>
+    </w:p>
+    <w:p>
+      <w:pPr>
+        <w:pStyle w:val="Akapitzlist"/>
+        <w:numPr>
+          <w:ilvl w:val="0"/>
+          <w:numId w:val="6"/>
+        </w:numPr>
+        <w:jc w:val="both"/>
+      </w:pPr>
+      <w:r>
+        <w:lastRenderedPageBreak/>
+        <w:t>Podstawowe dane identyfikacyjne klienta.</w:t>
+      </w:r>
+    </w:p>
+    <w:p>
+      <w:pPr>
+        <w:pStyle w:val="Akapitzlist"/>
+        <w:numPr>
+          <w:ilvl w:val="0"/>
+          <w:numId w:val="6"/>
+        </w:numPr>
+        <w:jc w:val="both"/>
+      </w:pPr>
+      <w:r>
+        <w:t>Podstawowe dane klienta.</w:t>
+      </w:r>
+    </w:p>
+    <w:p>
+      <w:pPr>
+        <w:pStyle w:val="Akapitzlist"/>
+        <w:numPr>
+          <w:ilvl w:val="0"/>
+          <w:numId w:val="6"/>
+        </w:numPr>
+        <w:jc w:val="both"/>
+      </w:pPr>
+      <w:r>
+        <w:t>Sprzedaż całkowita netto – przedstawia całkowitą sprzedaż netto do danego klienta (towary i usługi).</w:t>
+      </w:r>
+    </w:p>
+    <w:p>
+      <w:pPr>
+        <w:pStyle w:val="Akapitzlist"/>
+        <w:numPr>
+          <w:ilvl w:val="0"/>
+          <w:numId w:val="6"/>
+        </w:numPr>
+        <w:jc w:val="both"/>
+      </w:pPr>
+      <w:r>
+        <w:t xml:space="preserve">Sprzedaż towarów netto - przedstawia wartość sprzedaży netto dla towarów dla wybranego klienta. </w:t>
+      </w:r>
+    </w:p>
+    <w:p>
+      <w:pPr>
+        <w:pStyle w:val="Akapitzlist"/>
+        <w:numPr>
+          <w:ilvl w:val="0"/>
+          <w:numId w:val="6"/>
+        </w:numPr>
+        <w:jc w:val="both"/>
+      </w:pPr>
+      <w:r>
+        <w:t xml:space="preserve">Sprzedaż netto bieżący rok - przedstawia wartość sprzedaży netto dla do wybranego klienta w bieżącym roku (towary i usługi) </w:t>
+      </w:r>
+    </w:p>
+    <w:p>
+      <w:pPr>
+        <w:pStyle w:val="Akapitzlist"/>
+        <w:numPr>
+          <w:ilvl w:val="0"/>
+          <w:numId w:val="6"/>
+        </w:numPr>
+        <w:jc w:val="both"/>
+      </w:pPr>
+      <w:r>
+        <w:t>Zysk ze sprzedaży towarów netto - przedstawia wartość zysku dla towarów dla danego klienta.</w:t>
+      </w:r>
+    </w:p>
+    <w:p>
+      <w:pPr>
+        <w:pStyle w:val="Akapitzlist"/>
+        <w:numPr>
+          <w:ilvl w:val="0"/>
+          <w:numId w:val="6"/>
+        </w:numPr>
+        <w:jc w:val="both"/>
+      </w:pPr>
+      <w:r>
+        <w:t>Średni rabat – przedstawia średni rabat udzielony klientowi na fakturach.</w:t>
+      </w:r>
+    </w:p>
+    <w:p>
+      <w:pPr>
+        <w:pStyle w:val="Akapitzlist"/>
+        <w:numPr>
+          <w:ilvl w:val="0"/>
+          <w:numId w:val="6"/>
+        </w:numPr>
+        <w:jc w:val="both"/>
+      </w:pPr>
+      <w:r>
+        <w:t>Marża na towarach – przedstawia marżę osiągnięta na sprzedaży towarów uwzględniając wybrane filtry.</w:t>
+      </w:r>
+    </w:p>
+    <w:p>
+      <w:pPr>
+        <w:pStyle w:val="Akapitzlist"/>
+        <w:numPr>
+          <w:ilvl w:val="0"/>
+          <w:numId w:val="6"/>
+        </w:numPr>
+        <w:jc w:val="both"/>
+      </w:pPr>
+      <w:r>
+        <w:t>Otwarte płatności brutto – przedstawia wartość brutto wszystkich nieopłaconych faktur zarówno przed terminem płatności jak i po terminie płatności.</w:t>
+      </w:r>
+    </w:p>
+    <w:p>
+      <w:pPr>
+        <w:pStyle w:val="Akapitzlist"/>
+        <w:numPr>
+          <w:ilvl w:val="0"/>
+          <w:numId w:val="6"/>
+        </w:numPr>
+        <w:jc w:val="both"/>
+      </w:pPr>
+      <w:r>
+        <w:rPr>
+          <w:noProof/>
+        </w:rPr>
+        <w:t>Przeterminowane płatności brutto - przedstawia wartość brutto wszystkich nieopłaconych</w:t>
+      </w:r>
+      <w:r>
+        <w:t xml:space="preserve"> faktur po terminie płatności.</w:t>
+      </w:r>
+    </w:p>
+    <w:p>
+      <w:pPr>
+        <w:pStyle w:val="Akapitzlist"/>
+        <w:numPr>
+          <w:ilvl w:val="0"/>
+          <w:numId w:val="6"/>
+        </w:numPr>
+        <w:jc w:val="both"/>
+      </w:pPr>
+      <w:r>
+        <w:t xml:space="preserve">Ilość </w:t>
+      </w:r>
+      <w:r>
+        <w:t xml:space="preserve">otwartych </w:t>
+      </w:r>
+      <w:r>
+        <w:t xml:space="preserve">faktur - przedstawia ilość </w:t>
+      </w:r>
+      <w:r>
+        <w:t xml:space="preserve">nieopłaconych </w:t>
+      </w:r>
+      <w:r>
+        <w:t>faktur.</w:t>
+      </w:r>
+    </w:p>
+    <w:p>
+      <w:pPr>
+        <w:pStyle w:val="Akapitzlist"/>
+        <w:numPr>
+          <w:ilvl w:val="0"/>
+          <w:numId w:val="6"/>
+        </w:numPr>
+        <w:jc w:val="both"/>
+      </w:pPr>
+      <w:r>
+        <w:t>Ilość przeterminowanych faktur - przedstawia ilość nieopłaconych faktur po terminie płatności.</w:t>
+      </w:r>
+    </w:p>
+    <w:p>
+      <w:pPr>
+        <w:pStyle w:val="Akapitzlist"/>
+        <w:numPr>
+          <w:ilvl w:val="0"/>
+          <w:numId w:val="6"/>
+        </w:numPr>
+        <w:jc w:val="both"/>
+      </w:pPr>
+      <w:r>
+        <w:t>Wykres przedstawia wartość sprzedaży netto towarów w czasie.</w:t>
+      </w:r>
+    </w:p>
+    <w:p>
+      <w:pPr>
+        <w:pStyle w:val="Akapitzlist"/>
+        <w:ind w:left="360"/>
+        <w:jc w:val="both"/>
+      </w:pPr>
+      <w:r>
+        <w:t>Po wybraniu tylko roku  w pasku wyboru dat (3) widoczna jest sprzedaż w poszczególnych miesiącach wybranego roku.</w:t>
+      </w:r>
+    </w:p>
+    <w:p>
+      <w:pPr>
+        <w:pStyle w:val="Akapitzlist"/>
+        <w:ind w:left="360"/>
+        <w:jc w:val="both"/>
+      </w:pPr>
+      <w:r>
+        <w:rPr>
+          <w:noProof/>
+        </w:rPr>
+        <w:drawing>
+          <wp:inline distT="0" distB="0" distL="0" distR="0" wp14:anchorId="77565B06" wp14:editId="5BDFCF79">
+            <wp:extent cx="5334425" cy="1377117"/>
+            <wp:effectExtent l="0" t="0" r="0" b="0"/>
+            <wp:docPr id="617876320" name="Obraz 2" descr="Obraz zawierający tekst, zrzut ekranu, numer, oprogramowanie&#10;&#10;Zawartość wygenerowana przez AI może być niepoprawna."/>
+            <wp:cNvGraphicFramePr>
+              <a:graphicFrameLocks xmlns:a="http://schemas.openxmlformats.org/drawingml/2006/main" noChangeAspect="1"/>
+            </wp:cNvGraphicFramePr>
+            <a:graphic xmlns:a="http://schemas.openxmlformats.org/drawingml/2006/main">
+              <a:graphicData uri="http://schemas.openxmlformats.org/drawingml/2006/picture">
+                <pic:pic xmlns:pic="http://schemas.openxmlformats.org/drawingml/2006/picture">
+                  <pic:nvPicPr>
+                    <pic:cNvPr id="617876320" name="Obraz 2" descr="Obraz zawierający tekst, zrzut ekranu, numer, oprogramowanie&#10;&#10;Zawartość wygenerowana przez AI może być niepoprawna."/>
+                    <pic:cNvPicPr>
+                      <a:picLocks noChangeAspect="1" noChangeArrowheads="1"/>
+                    </pic:cNvPicPr>
+                  </pic:nvPicPr>
+                  <pic:blipFill rotWithShape="1">
+                    <a:blip r:embed="rId10" cstate="print">
+                      <a:extLst>
+                        <a:ext uri="{28A0092B-C50C-407E-A947-70E740481C1C}">
+                          <a14:useLocalDpi xmlns:a14="http://schemas.microsoft.com/office/drawing/2010/main" val="0"/>
+                        </a:ext>
+                      </a:extLst>
+                    </a:blip>
+                    <a:srcRect t="10426" b="43036"/>
+                    <a:stretch>
+                      <a:fillRect/>
+                    </a:stretch>
+                  </pic:blipFill>
+                  <pic:spPr bwMode="auto">
+                    <a:xfrm>
+                      <a:off x="0" y="0"/>
+                      <a:ext cx="5377327" cy="1388193"/>
+                    </a:xfrm>
+                    <a:prstGeom prst="rect">
+                      <a:avLst/>
+                    </a:prstGeom>
+                    <a:noFill/>
+                    <a:ln>
+                      <a:noFill/>
+                    </a:ln>
+                    <a:extLst>
+                      <a:ext uri="{53640926-AAD7-44D8-BBD7-CCE9431645EC}">
+                        <a14:shadowObscured xmlns:a14="http://schemas.microsoft.com/office/drawing/2010/main"/>
+                      </a:ext>
+                    </a:extLst>
+                  </pic:spPr>
+                </pic:pic>
+              </a:graphicData>
+            </a:graphic>
+          </wp:inline>
+        </w:drawing>
+      </w:r>
+    </w:p>
+    <w:p>
+      <w:pPr>
+        <w:pStyle w:val="Akapitzlist"/>
+        <w:ind w:left="360"/>
+        <w:jc w:val="both"/>
+      </w:pPr>
+      <w:r>
+        <w:t>Po wybraniu tylko miesiąca w pasku wyboru dat (3) widoczna jest wartość sprzedaży towarów netto w analogicznych miesiącach poprzednich lat.</w:t>
+      </w:r>
+    </w:p>
+    <w:p>
+      <w:pPr>
+        <w:jc w:val="both"/>
+      </w:pPr>
+      <w:r>
+        <w:rPr>
+          <w:noProof/>
+        </w:rPr>
+        <w:lastRenderedPageBreak/>
+        <w:drawing>
+          <wp:inline distT="0" distB="0" distL="0" distR="0" wp14:anchorId="5423D225" wp14:editId="0A7CEFD5">
+            <wp:extent cx="5593278" cy="2123361"/>
+            <wp:effectExtent l="0" t="0" r="7620" b="0"/>
+            <wp:docPr id="104898220" name="Obraz 3" descr="Obraz zawierający tekst, zrzut ekranu, numer, oprogramowanie&#10;&#10;Zawartość wygenerowana przez AI może być niepoprawna."/>
+            <wp:cNvGraphicFramePr>
+              <a:graphicFrameLocks xmlns:a="http://schemas.openxmlformats.org/drawingml/2006/main" noChangeAspect="1"/>
+            </wp:cNvGraphicFramePr>
+            <a:graphic xmlns:a="http://schemas.openxmlformats.org/drawingml/2006/main">
+              <a:graphicData uri="http://schemas.openxmlformats.org/drawingml/2006/picture">
+                <pic:pic xmlns:pic="http://schemas.openxmlformats.org/drawingml/2006/picture">
+                  <pic:nvPicPr>
+                    <pic:cNvPr id="104898220" name="Obraz 3" descr="Obraz zawierający tekst, zrzut ekranu, numer, oprogramowanie&#10;&#10;Zawartość wygenerowana przez AI może być niepoprawna."/>
+                    <pic:cNvPicPr>
+                      <a:picLocks noChangeAspect="1" noChangeArrowheads="1"/>
+                    </pic:cNvPicPr>
+                  </pic:nvPicPr>
+                  <pic:blipFill rotWithShape="1">
+                    <a:blip r:embed="rId11" cstate="print">
+                      <a:extLst>
+                        <a:ext uri="{28A0092B-C50C-407E-A947-70E740481C1C}">
+                          <a14:useLocalDpi xmlns:a14="http://schemas.microsoft.com/office/drawing/2010/main" val="0"/>
+                        </a:ext>
+                      </a:extLst>
+                    </a:blip>
+                    <a:srcRect t="12148" b="20102"/>
+                    <a:stretch>
+                      <a:fillRect/>
+                    </a:stretch>
+                  </pic:blipFill>
+                  <pic:spPr bwMode="auto">
+                    <a:xfrm>
+                      <a:off x="0" y="0"/>
+                      <a:ext cx="5599146" cy="2125589"/>
+                    </a:xfrm>
+                    <a:prstGeom prst="rect">
+                      <a:avLst/>
+                    </a:prstGeom>
+                    <a:noFill/>
+                    <a:ln>
+                      <a:noFill/>
+                    </a:ln>
+                    <a:extLst>
+                      <a:ext uri="{53640926-AAD7-44D8-BBD7-CCE9431645EC}">
+                        <a14:shadowObscured xmlns:a14="http://schemas.microsoft.com/office/drawing/2010/main"/>
+                      </a:ext>
+                    </a:extLst>
+                  </pic:spPr>
+                </pic:pic>
+              </a:graphicData>
+            </a:graphic>
+          </wp:inline>
+        </w:drawing>
+      </w:r>
+    </w:p>
+    <w:p>
+      <w:pPr>
+        <w:pStyle w:val="Akapitzlist"/>
+        <w:numPr>
+          <w:ilvl w:val="0"/>
+          <w:numId w:val="6"/>
+        </w:numPr>
+        <w:jc w:val="both"/>
+      </w:pPr>
+      <w:r>
+        <w:t>Marka – tabela przedstawia sprzedaż netto towarów oraz udzielony średni rabat dla towarów poszczególnych marek.</w:t>
+      </w:r>
+    </w:p>
+    <w:p>
+      <w:pPr>
+        <w:pStyle w:val="Akapitzlist"/>
+        <w:numPr>
+          <w:ilvl w:val="0"/>
+          <w:numId w:val="6"/>
+        </w:numPr>
+        <w:jc w:val="both"/>
+      </w:pPr>
+      <w:r>
+        <w:t>Grupa produktowa - tabela przedstawia sprzedaż netto towarów, ilość sztuk, udzielony średni rabat oraz marże uzyskaną dla danej grupy.</w:t>
+      </w:r>
+    </w:p>
+    <w:p>
+      <w:pPr>
+        <w:jc w:val="both"/>
+      </w:pPr>
+    </w:p>
+    <w:p>
+      <w:pPr>
+        <w:pStyle w:val="Akapitzlist"/>
+        <w:numPr>
+          <w:ilvl w:val="0"/>
+          <w:numId w:val="6"/>
+        </w:numPr>
+        <w:jc w:val="both"/>
+      </w:pPr>
+      <w:r>
+        <w:br w:type="page"/>
+      </w:r>
+    </w:p>
+    <w:p>
+      <w:pPr>
+        <w:pStyle w:val="Nagwek2"/>
+      </w:pPr>
+      <w:bookmarkStart w:id="3" w:name="_Faktury"/>
+      <w:bookmarkStart w:id="4" w:name="_Toc205276325"/>
+      <w:bookmarkEnd w:id="3"/>
+      <w:r>
+        <w:rPr>
+          <w:noProof/>
+        </w:rPr>
+        <w:lastRenderedPageBreak/>
+        <w:drawing>
+          <wp:anchor distT="0" distB="0" distL="114300" distR="114300" simplePos="0" relativeHeight="251669504" behindDoc="0" locked="0" layoutInCell="1" allowOverlap="1" wp14:anchorId="44DB610F" wp14:editId="7784C54E">
+            <wp:simplePos x="0" y="0"/>
+            <wp:positionH relativeFrom="margin">
+              <wp:align>center</wp:align>
+            </wp:positionH>
+            <wp:positionV relativeFrom="paragraph">
+              <wp:posOffset>416781</wp:posOffset>
+            </wp:positionV>
+            <wp:extent cx="6840000" cy="3854573"/>
+            <wp:effectExtent l="0" t="0" r="0" b="0"/>
+            <wp:wrapSquare wrapText="bothSides"/>
+            <wp:docPr id="67645012" name="Obraz 2"/>
+            <wp:cNvGraphicFramePr>
+              <a:graphicFrameLocks xmlns:a="http://schemas.openxmlformats.org/drawingml/2006/main" noChangeAspect="1"/>
+            </wp:cNvGraphicFramePr>
+            <a:graphic xmlns:a="http://schemas.openxmlformats.org/drawingml/2006/main">
+              <a:graphicData uri="http://schemas.openxmlformats.org/drawingml/2006/picture">
+                <pic:pic xmlns:pic="http://schemas.openxmlformats.org/drawingml/2006/picture">
+                  <pic:nvPicPr>
+                    <pic:cNvPr id="0" name="Picture 2"/>
+                    <pic:cNvPicPr>
+                      <a:picLocks noChangeAspect="1" noChangeArrowheads="1"/>
+                    </pic:cNvPicPr>
+                  </pic:nvPicPr>
+                  <pic:blipFill>
+                    <a:blip r:embed="rId13">
+                      <a:extLst>
+                        <a:ext uri="{28A0092B-C50C-407E-A947-70E740481C1C}">
+                          <a14:useLocalDpi xmlns:a14="http://schemas.microsoft.com/office/drawing/2010/main" val="0"/>
+                        </a:ext>
+                      </a:extLst>
+                    </a:blip>
+                    <a:srcRect/>
+                    <a:stretch>
+                      <a:fillRect/>
+                    </a:stretch>
+                  </pic:blipFill>
+                  <pic:spPr bwMode="auto">
+                    <a:xfrm>
+                      <a:off x="0" y="0"/>
+                      <a:ext cx="6840000" cy="3854573"/>
+                    </a:xfrm>
+                    <a:prstGeom prst="rect">
+                      <a:avLst/>
+                    </a:prstGeom>
+                    <a:noFill/>
+                    <a:ln>
+                      <a:noFill/>
+                    </a:ln>
+                  </pic:spPr>
+                </pic:pic>
+              </a:graphicData>
+            </a:graphic>
+            <wp14:sizeRelH relativeFrom="page">
+              <wp14:pctWidth>0</wp14:pctWidth>
+            </wp14:sizeRelH>
+            <wp14:sizeRelV relativeFrom="page">
+              <wp14:pctHeight>0</wp14:pctHeight>
+            </wp14:sizeRelV>
+          </wp:anchor>
+        </w:drawing>
+      </w:r>
+      <w:r>
+        <w:t>Faktur</w:t>
+      </w:r>
+      <w:r>
+        <w:t>y</w:t>
+      </w:r>
+      <w:bookmarkEnd w:id="4"/>
+    </w:p>
+    <w:p/>
+    <w:p>
+      <w:pPr>
+        <w:jc w:val="both"/>
+      </w:pPr>
+      <w:r>
+        <w:t>Strona przedstawia informacje o fakturach i ich szczegółach.</w:t>
+      </w:r>
+    </w:p>
+    <w:p>
+      <w:pPr>
+        <w:pStyle w:val="Akapitzlist"/>
+        <w:ind w:left="360"/>
+        <w:jc w:val="both"/>
+      </w:pPr>
+    </w:p>
+    <w:p>
+      <w:r>
+        <w:t>Opis wizualizacji:</w:t>
+      </w:r>
+    </w:p>
+    <w:p>
+      <w:pPr>
+        <w:pStyle w:val="Akapitzlist"/>
+        <w:numPr>
+          <w:ilvl w:val="0"/>
+          <w:numId w:val="8"/>
+        </w:numPr>
+        <w:jc w:val="both"/>
+      </w:pPr>
+      <w:r>
+        <w:t>Panel nawigacyjny służący do przechodzenia do innych zakładek raportu. Po najechaniu kursorem myszy na ikonę wyświetla się podpowiedź docelowej strony.</w:t>
+      </w:r>
+    </w:p>
+    <w:p>
+      <w:pPr>
+        <w:pStyle w:val="Akapitzlist"/>
+        <w:numPr>
+          <w:ilvl w:val="0"/>
+          <w:numId w:val="8"/>
+        </w:numPr>
+        <w:jc w:val="both"/>
+      </w:pPr>
+      <w:r>
+        <w:t xml:space="preserve">Panel do wyboru handlowca dla którego wyświetlane są dane w raporcie. </w:t>
+      </w:r>
+    </w:p>
+    <w:p>
+      <w:pPr>
+        <w:pStyle w:val="Akapitzlist"/>
+        <w:numPr>
+          <w:ilvl w:val="0"/>
+          <w:numId w:val="8"/>
+        </w:numPr>
+        <w:jc w:val="both"/>
+      </w:pPr>
+      <w:r>
+        <w:t xml:space="preserve">Filtr dat służący do wyboru roku oraz miesiąca dla którego wyświetlane są dane na wizualizacji. </w:t>
+      </w:r>
+    </w:p>
+    <w:p>
+      <w:pPr>
+        <w:pStyle w:val="Akapitzlist"/>
+        <w:numPr>
+          <w:ilvl w:val="0"/>
+          <w:numId w:val="8"/>
+        </w:numPr>
+        <w:jc w:val="both"/>
+      </w:pPr>
+      <w:r>
+        <w:t>Filtr spółki pozwala wyświetlić faktury w wybranej spółce.</w:t>
+      </w:r>
+    </w:p>
+    <w:p>
+      <w:pPr>
+        <w:pStyle w:val="Akapitzlist"/>
+        <w:numPr>
+          <w:ilvl w:val="0"/>
+          <w:numId w:val="8"/>
+        </w:numPr>
+        <w:jc w:val="both"/>
+      </w:pPr>
+      <w:r>
+        <w:t>Filtr firm powiązanych – pozwala odfiltrować sprzedaż do spółek powiązanych lub niepowiązanych.</w:t>
+      </w:r>
+    </w:p>
+    <w:p>
+      <w:pPr>
+        <w:pStyle w:val="Akapitzlist"/>
+        <w:numPr>
+          <w:ilvl w:val="0"/>
+          <w:numId w:val="8"/>
+        </w:numPr>
+        <w:jc w:val="both"/>
+      </w:pPr>
+      <w:r>
+        <w:t>Filtr profilu klienta – pozwala odfiltrować faktury do konkretnego profilu klienta.</w:t>
+      </w:r>
+    </w:p>
+    <w:p>
+      <w:pPr>
+        <w:pStyle w:val="Akapitzlist"/>
+        <w:numPr>
+          <w:ilvl w:val="0"/>
+          <w:numId w:val="8"/>
+        </w:numPr>
+        <w:jc w:val="both"/>
+      </w:pPr>
+      <w:r>
+        <w:t>Filtr Grupy Produktowej - pozwala odfiltrować faktury konkretnych grup produktowych.</w:t>
+      </w:r>
+    </w:p>
+    <w:p>
+      <w:pPr>
+        <w:pStyle w:val="Akapitzlist"/>
+        <w:numPr>
+          <w:ilvl w:val="0"/>
+          <w:numId w:val="8"/>
+        </w:numPr>
+        <w:jc w:val="both"/>
+      </w:pPr>
+      <w:r>
+        <w:t xml:space="preserve">Filtr </w:t>
+      </w:r>
+      <w:r>
+        <w:t>Rodzaj sprzedaży – pozwala odfiltrować sprzedaż towarów, usług oraz zaliczki</w:t>
+      </w:r>
+      <w:r>
+        <w:t xml:space="preserve"> na fakturach</w:t>
+      </w:r>
+      <w:r>
+        <w:t>.</w:t>
+      </w:r>
+    </w:p>
+    <w:p>
+      <w:pPr>
+        <w:pStyle w:val="Akapitzlist"/>
+        <w:numPr>
+          <w:ilvl w:val="0"/>
+          <w:numId w:val="8"/>
+        </w:numPr>
+        <w:jc w:val="both"/>
+      </w:pPr>
+      <w:r>
+        <w:t>Filtr Regionów – pozwala odfiltrować faktury w konkretnym regionie.</w:t>
+      </w:r>
+    </w:p>
+    <w:p>
+      <w:pPr>
+        <w:pStyle w:val="Akapitzlist"/>
+        <w:numPr>
+          <w:ilvl w:val="0"/>
+          <w:numId w:val="8"/>
+        </w:numPr>
+        <w:jc w:val="both"/>
+      </w:pPr>
+      <w:r>
+        <w:lastRenderedPageBreak/>
+        <w:t>Nazwa klienta – pozwala odfiltrować faktury dla danego klienta po jego nazwie.</w:t>
+      </w:r>
+    </w:p>
+    <w:p>
+      <w:pPr>
+        <w:pStyle w:val="Akapitzlist"/>
+        <w:numPr>
+          <w:ilvl w:val="0"/>
+          <w:numId w:val="8"/>
+        </w:numPr>
+        <w:jc w:val="both"/>
+      </w:pPr>
+      <w:r>
+        <w:t xml:space="preserve">Filtr </w:t>
+      </w:r>
+      <w:proofErr w:type="spellStart"/>
+      <w:r>
+        <w:t>Ecom</w:t>
+      </w:r>
+      <w:proofErr w:type="spellEnd"/>
+      <w:r>
+        <w:t xml:space="preserve"> – pozwala odfiltrować faktury wystawione za pośrednictwem sklepu internetowego.</w:t>
+      </w:r>
+    </w:p>
+    <w:p>
+      <w:pPr>
+        <w:pStyle w:val="Akapitzlist"/>
+        <w:numPr>
+          <w:ilvl w:val="0"/>
+          <w:numId w:val="8"/>
+        </w:numPr>
+        <w:jc w:val="both"/>
+      </w:pPr>
+      <w:r>
+        <w:t>Filtr Nr faktury – pozwala odfiltrować faktury po ich numerze.</w:t>
+      </w:r>
+    </w:p>
+    <w:p>
+      <w:pPr>
+        <w:pStyle w:val="Akapitzlist"/>
+        <w:numPr>
+          <w:ilvl w:val="0"/>
+          <w:numId w:val="8"/>
+        </w:numPr>
+        <w:jc w:val="both"/>
+      </w:pPr>
+      <w:r>
+        <w:t>Filtr Producent – pozwala odfiltrować faktury po towarach pochodzących od wybranego producenta.</w:t>
+      </w:r>
+    </w:p>
+    <w:p>
+      <w:pPr>
+        <w:pStyle w:val="Akapitzlist"/>
+        <w:numPr>
+          <w:ilvl w:val="0"/>
+          <w:numId w:val="8"/>
+        </w:numPr>
+        <w:jc w:val="both"/>
+      </w:pPr>
+      <w:r>
+        <w:t>Filtr Nr projektu – pozwala odfiltrować sprzedaż dla konkretnego projektu.</w:t>
+      </w:r>
+    </w:p>
+    <w:p>
+      <w:pPr>
+        <w:pStyle w:val="Akapitzlist"/>
+        <w:numPr>
+          <w:ilvl w:val="0"/>
+          <w:numId w:val="8"/>
+        </w:numPr>
+        <w:jc w:val="both"/>
+      </w:pPr>
+      <w:r>
+        <w:t>Tabela z fakturami i informacjami o sprzedaży.</w:t>
+      </w:r>
+    </w:p>
+    <w:p>
+      <w:pPr>
+        <w:pStyle w:val="Akapitzlist"/>
+        <w:ind w:left="360"/>
+        <w:jc w:val="both"/>
+      </w:pPr>
+      <w:r>
+        <w:t>Faktury z pomarańczowym podświetleniem to faktury z terminem płatności krótszym niż 7 dni.</w:t>
+      </w:r>
+    </w:p>
+    <w:p>
+      <w:pPr>
+        <w:pStyle w:val="Akapitzlist"/>
+        <w:ind w:left="360"/>
+        <w:jc w:val="both"/>
+      </w:pPr>
+      <w:r>
+        <w:t>Faktury z czerwonym podświetleniem to faktury po terminie płatności.</w:t>
+      </w:r>
+    </w:p>
+    <w:p>
+      <w:pPr>
+        <w:pStyle w:val="Akapitzlist"/>
+        <w:numPr>
+          <w:ilvl w:val="0"/>
+          <w:numId w:val="8"/>
+        </w:numPr>
+        <w:jc w:val="both"/>
+      </w:pPr>
+      <w:r>
+        <w:t xml:space="preserve">Przycisk przejścia do </w:t>
+      </w:r>
+      <w:hyperlink w:anchor="_Szczegóły_faktury" w:history="1">
+        <w:r>
+          <w:rPr>
+            <w:rStyle w:val="Hipercze"/>
+          </w:rPr>
+          <w:t>S</w:t>
+        </w:r>
+        <w:r>
+          <w:rPr>
+            <w:rStyle w:val="Hipercze"/>
+          </w:rPr>
+          <w:t>zczegółów fa</w:t>
+        </w:r>
+        <w:r>
+          <w:rPr>
+            <w:rStyle w:val="Hipercze"/>
+          </w:rPr>
+          <w:t>k</w:t>
+        </w:r>
+        <w:r>
+          <w:rPr>
+            <w:rStyle w:val="Hipercze"/>
+          </w:rPr>
+          <w:t>tury</w:t>
+        </w:r>
+      </w:hyperlink>
+      <w:r>
+        <w:t>.</w:t>
+      </w:r>
+      <w:r>
+        <w:t xml:space="preserve"> Uaktywnia się po kliknięciu w wiersz z fakturą.</w:t>
+      </w:r>
+    </w:p>
+    <w:p>
+      <w:r>
+        <w:br w:type="page"/>
+      </w:r>
+    </w:p>
+    <w:p>
+      <w:pPr>
+        <w:pStyle w:val="Nagwek2"/>
+      </w:pPr>
+      <w:bookmarkStart w:id="5" w:name="_Szczegóły_faktury"/>
+      <w:bookmarkStart w:id="6" w:name="_Toc205276326"/>
+      <w:bookmarkEnd w:id="5"/>
+      <w:r>
+        <w:lastRenderedPageBreak/>
+        <w:t>Szczegóły faktury</w:t>
+      </w:r>
+      <w:bookmarkEnd w:id="6"/>
+    </w:p>
+    <w:p>
+      <w:pPr>
+        <w:jc w:val="both"/>
+      </w:pPr>
+      <w:r>
+        <w:rPr>
+          <w:noProof/>
+        </w:rPr>
+        <w:drawing>
+          <wp:anchor distT="0" distB="0" distL="114300" distR="114300" simplePos="0" relativeHeight="251670528" behindDoc="0" locked="0" layoutInCell="1" allowOverlap="1" wp14:anchorId="3EA1F263" wp14:editId="01F6017A">
+            <wp:simplePos x="0" y="0"/>
+            <wp:positionH relativeFrom="margin">
+              <wp:align>center</wp:align>
+            </wp:positionH>
+            <wp:positionV relativeFrom="paragraph">
+              <wp:posOffset>190831</wp:posOffset>
+            </wp:positionV>
+            <wp:extent cx="7020000" cy="3932224"/>
+            <wp:effectExtent l="0" t="0" r="0" b="0"/>
+            <wp:wrapSquare wrapText="bothSides"/>
+            <wp:docPr id="1723988488" name="Obraz 3"/>
+            <wp:cNvGraphicFramePr>
+              <a:graphicFrameLocks xmlns:a="http://schemas.openxmlformats.org/drawingml/2006/main" noChangeAspect="1"/>
+            </wp:cNvGraphicFramePr>
+            <a:graphic xmlns:a="http://schemas.openxmlformats.org/drawingml/2006/main">
+              <a:graphicData uri="http://schemas.openxmlformats.org/drawingml/2006/picture">
+                <pic:pic xmlns:pic="http://schemas.openxmlformats.org/drawingml/2006/picture">
+                  <pic:nvPicPr>
+                    <pic:cNvPr id="0" name="Picture 3"/>
+                    <pic:cNvPicPr>
+                      <a:picLocks noChangeAspect="1" noChangeArrowheads="1"/>
+                    </pic:cNvPicPr>
+                  </pic:nvPicPr>
+                  <pic:blipFill>
+                    <a:blip r:embed="rId14">
+                      <a:extLst>
+                        <a:ext uri="{28A0092B-C50C-407E-A947-70E740481C1C}">
+                          <a14:useLocalDpi xmlns:a14="http://schemas.microsoft.com/office/drawing/2010/main" val="0"/>
+                        </a:ext>
+                      </a:extLst>
+                    </a:blip>
+                    <a:srcRect/>
+                    <a:stretch>
+                      <a:fillRect/>
+                    </a:stretch>
+                  </pic:blipFill>
+                  <pic:spPr bwMode="auto">
+                    <a:xfrm>
+                      <a:off x="0" y="0"/>
+                      <a:ext cx="7020000" cy="3932224"/>
+                    </a:xfrm>
+                    <a:prstGeom prst="rect">
+                      <a:avLst/>
+                    </a:prstGeom>
+                    <a:noFill/>
+                    <a:ln>
+                      <a:noFill/>
+                    </a:ln>
+                  </pic:spPr>
+                </pic:pic>
+              </a:graphicData>
+            </a:graphic>
+            <wp14:sizeRelH relativeFrom="page">
+              <wp14:pctWidth>0</wp14:pctWidth>
+            </wp14:sizeRelH>
+            <wp14:sizeRelV relativeFrom="page">
+              <wp14:pctHeight>0</wp14:pctHeight>
+            </wp14:sizeRelV>
+          </wp:anchor>
+        </w:drawing>
+      </w:r>
     </w:p>
     <w:p>
       <w:pPr>
@@ -3140,14 +3081,6 @@
       <w:pPr>
         <w:jc w:val="both"/>
       </w:pPr>
-      <w:r>
-        <w:t>Nie ma możliwości dostania się od szczegółów faktury w inny sposób niż poprzez stronę Faktury.</w:t>
-      </w:r>
-    </w:p>
-    <w:p>
-      <w:pPr>
-        <w:jc w:val="both"/>
-      </w:pPr>
     </w:p>
     <w:p>
       <w:r>
@@ -3203,6 +3136,19 @@
         <w:jc w:val="both"/>
       </w:pPr>
       <w:r>
+        <w:t xml:space="preserve">Marża na towarach – pokazuje marżę uzyskaną na sprzedaży towarów. </w:t>
+      </w:r>
+    </w:p>
+    <w:p>
+      <w:pPr>
+        <w:pStyle w:val="Akapitzlist"/>
+        <w:numPr>
+          <w:ilvl w:val="0"/>
+          <w:numId w:val="9"/>
+        </w:numPr>
+        <w:jc w:val="both"/>
+      </w:pPr>
+      <w:r>
         <w:t>Rabat – to średnia rabatu udzielona dla danej fakturze.</w:t>
       </w:r>
     </w:p>
@@ -3255,6 +3201,7 @@
         <w:jc w:val="both"/>
       </w:pPr>
       <w:r>
+        <w:lastRenderedPageBreak/>
         <w:t>Szczegóły pozycji na fakturze. Przedstawia informacje o urządzeniach, ich ilości, wartości oraz podstawowe informacje</w:t>
       </w:r>
     </w:p>
@@ -3268,8 +3215,33 @@
         <w:jc w:val="both"/>
       </w:pPr>
       <w:r>
-        <w:lastRenderedPageBreak/>
         <w:t>Wizualizacja przedstawia informacje o numerze zamówienia z którego została utworzona faktura, numer oferty na podstawie której została utworzona faktura oraz nr projektu do którego należy faktura.</w:t>
+      </w:r>
+    </w:p>
+    <w:p>
+      <w:pPr>
+        <w:pStyle w:val="Akapitzlist"/>
+        <w:numPr>
+          <w:ilvl w:val="0"/>
+          <w:numId w:val="9"/>
+        </w:numPr>
+        <w:jc w:val="both"/>
+      </w:pPr>
+      <w:r>
+        <w:t>Marka – tabela przedstawia sprzedaż netto towarów oraz udzielony średni rabat dla towarów poszczególnych marek.</w:t>
+      </w:r>
+    </w:p>
+    <w:p>
+      <w:pPr>
+        <w:pStyle w:val="Akapitzlist"/>
+        <w:numPr>
+          <w:ilvl w:val="0"/>
+          <w:numId w:val="9"/>
+        </w:numPr>
+        <w:jc w:val="both"/>
+      </w:pPr>
+      <w:r>
+        <w:t>Grupa produktowa - tabela przedstawia sprzedaż netto towarów, ilość sztuk, udzielony średni rabat oraz marże uzyskaną dla danej grupy.</w:t>
       </w:r>
     </w:p>
     <w:p>
@@ -3305,7 +3277,7 @@
         <w:pStyle w:val="Nagwek2"/>
       </w:pPr>
       <w:bookmarkStart w:id="7" w:name="_Towary"/>
-      <w:bookmarkStart w:id="8" w:name="_Toc202765171"/>
+      <w:bookmarkStart w:id="8" w:name="_Toc205276327"/>
       <w:bookmarkEnd w:id="7"/>
       <w:r>
         <w:lastRenderedPageBreak/>
@@ -3344,7 +3316,7 @@
                     </pic:cNvPicPr>
                   </pic:nvPicPr>
                   <pic:blipFill>
-                    <a:blip r:embed="rId13">
+                    <a:blip r:embed="rId15">
                       <a:extLst>
                         <a:ext uri="{28A0092B-C50C-407E-A947-70E740481C1C}">
                           <a14:useLocalDpi xmlns:a14="http://schemas.microsoft.com/office/drawing/2010/main" val="0"/>
@@ -3488,7 +3460,7 @@
         <w:pStyle w:val="Nagwek2"/>
       </w:pPr>
       <w:bookmarkStart w:id="9" w:name="_Szczegóły_sprzedaży_towarów"/>
-      <w:bookmarkStart w:id="10" w:name="_Toc202765172"/>
+      <w:bookmarkStart w:id="10" w:name="_Toc205276328"/>
       <w:bookmarkEnd w:id="9"/>
       <w:r>
         <w:lastRenderedPageBreak/>
@@ -3530,7 +3502,7 @@
                     </pic:cNvPicPr>
                   </pic:nvPicPr>
                   <pic:blipFill>
-                    <a:blip r:embed="rId14">
+                    <a:blip r:embed="rId16">
                       <a:extLst>
                         <a:ext uri="{28A0092B-C50C-407E-A947-70E740481C1C}">
                           <a14:useLocalDpi xmlns:a14="http://schemas.microsoft.com/office/drawing/2010/main" val="0"/>
@@ -3601,7 +3573,7 @@
         <w:jc w:val="both"/>
       </w:pPr>
       <w:r>
-        <w:t>Wartość sprzedanych towarów w ciągu ostatnich 12 miesiącach w podziale na główną grupę produktową, Typ B, oraz konkretny symbol urządzenia.</w:t>
+        <w:t>Wartość sprzedanych towarów w ciągu ostatnich 12 miesiącach w podziale na główną grupę produktową, Typ B oraz konkretny symbol urządzenia.</w:t>
       </w:r>
     </w:p>
     <w:p>
@@ -3611,7 +3583,7 @@
         <w:jc w:val="both"/>
       </w:pPr>
       <w:r>
-        <w:t xml:space="preserve">Wizualizacja pozwala wejść w szczegóły zaczynając od głównej grupy produktowej do symbolu modelu. Aby sprawdzić wartość sprzedanych urządzeń należy kliknąć kolejno w grupy/urządzenia w hierarchii. </w:t>
+        <w:t>Wizualizacja pozwala wejść w szczegóły zaczynając od głównej grupy produktowej do symbolu modelu. Aby sprawdzić wartość sprzedanych urządzeń należy kliknąć kolejno w grupy/urządzenia w hierarchii.</w:t>
       </w:r>
     </w:p>
     <w:p>
@@ -3663,7 +3635,7 @@
                     </pic:cNvPicPr>
                   </pic:nvPicPr>
                   <pic:blipFill>
-                    <a:blip r:embed="rId15">
+                    <a:blip r:embed="rId17">
                       <a:extLst>
                         <a:ext uri="{28A0092B-C50C-407E-A947-70E740481C1C}">
                           <a14:useLocalDpi xmlns:a14="http://schemas.microsoft.com/office/drawing/2010/main" val="0"/>
@@ -3765,25 +3737,31 @@
       <w:pPr>
         <w:pStyle w:val="Nagwek2"/>
       </w:pPr>
-      <w:bookmarkStart w:id="11" w:name="_Toc202765173"/>
+      <w:bookmarkStart w:id="11" w:name="_Toc205276329"/>
+      <w:r>
+        <w:lastRenderedPageBreak/>
+        <w:t>Regiony i grupy urządzeń</w:t>
+      </w:r>
+      <w:bookmarkEnd w:id="11"/>
+    </w:p>
+    <w:p>
       <w:r>
         <w:rPr>
           <w:noProof/>
         </w:rPr>
-        <w:lastRenderedPageBreak/>
         <w:drawing>
-          <wp:anchor distT="0" distB="0" distL="114300" distR="114300" simplePos="0" relativeHeight="251665408" behindDoc="0" locked="0" layoutInCell="1" allowOverlap="1" wp14:anchorId="101835F5" wp14:editId="581366E0">
+          <wp:anchor distT="0" distB="0" distL="114300" distR="114300" simplePos="0" relativeHeight="251671552" behindDoc="0" locked="0" layoutInCell="1" allowOverlap="1" wp14:anchorId="5238FAF4" wp14:editId="4BFBE3D8">
             <wp:simplePos x="0" y="0"/>
             <wp:positionH relativeFrom="margin">
               <wp:align>center</wp:align>
             </wp:positionH>
             <wp:positionV relativeFrom="paragraph">
-              <wp:posOffset>551953</wp:posOffset>
+              <wp:posOffset>190279</wp:posOffset>
             </wp:positionV>
-            <wp:extent cx="7150241" cy="3960000"/>
-            <wp:effectExtent l="0" t="0" r="0" b="2540"/>
+            <wp:extent cx="6840000" cy="3854573"/>
+            <wp:effectExtent l="0" t="0" r="0" b="0"/>
             <wp:wrapSquare wrapText="bothSides"/>
-            <wp:docPr id="1521576956" name="Obraz 5"/>
+            <wp:docPr id="351754426" name="Obraz 1" descr="Obraz zawierający tekst, zrzut ekranu, numer, oprogramowanie&#10;&#10;Zawartość wygenerowana przez AI może być niepoprawna."/>
             <wp:cNvGraphicFramePr>
               <a:graphicFrameLocks xmlns:a="http://schemas.openxmlformats.org/drawingml/2006/main" noChangeAspect="1"/>
             </wp:cNvGraphicFramePr>
@@ -3791,13 +3769,13 @@
               <a:graphicData uri="http://schemas.openxmlformats.org/drawingml/2006/picture">
                 <pic:pic xmlns:pic="http://schemas.openxmlformats.org/drawingml/2006/picture">
                   <pic:nvPicPr>
-                    <pic:cNvPr id="0" name="Picture 5"/>
+                    <pic:cNvPr id="351754426" name="Obraz 1" descr="Obraz zawierający tekst, zrzut ekranu, numer, oprogramowanie&#10;&#10;Zawartość wygenerowana przez AI może być niepoprawna."/>
                     <pic:cNvPicPr>
                       <a:picLocks noChangeAspect="1" noChangeArrowheads="1"/>
                     </pic:cNvPicPr>
                   </pic:nvPicPr>
                   <pic:blipFill>
-                    <a:blip r:embed="rId16">
+                    <a:blip r:embed="rId18">
                       <a:extLst>
                         <a:ext uri="{28A0092B-C50C-407E-A947-70E740481C1C}">
                           <a14:useLocalDpi xmlns:a14="http://schemas.microsoft.com/office/drawing/2010/main" val="0"/>
@@ -3812,7 +3790,7 @@
                   <pic:spPr bwMode="auto">
                     <a:xfrm>
                       <a:off x="0" y="0"/>
-                      <a:ext cx="7150241" cy="3960000"/>
+                      <a:ext cx="6840000" cy="3854573"/>
                     </a:xfrm>
                     <a:prstGeom prst="rect">
                       <a:avLst/>
@@ -3834,21 +3812,16 @@
           </wp:anchor>
         </w:drawing>
       </w:r>
-      <w:r>
-        <w:t>Regiony i grupy urządzeń</w:t>
-      </w:r>
-      <w:bookmarkEnd w:id="11"/>
     </w:p>
     <w:p/>
+    <w:p>
+      <w:r>
+        <w:t>Strona przedstawiająca wartość sprzedaży głównych grup produktowych w podziale na regiony. Wartość sprzedaży opiera się tylko na zapłaconych fakturach.</w:t>
+      </w:r>
+    </w:p>
     <w:p/>
     <w:p>
       <w:r>
-        <w:t>Strona przedstawiająca wartość sprzedaży głównych grup produktowych w podziale na regiony. Wartość sprzedaży opiera się tylko na zapłaconych fakturach.</w:t>
-      </w:r>
-    </w:p>
-    <w:p/>
-    <w:p>
-      <w:r>
         <w:t>Opis wizualizacji:</w:t>
       </w:r>
     </w:p>
@@ -3857,7 +3830,46 @@
         <w:pStyle w:val="Akapitzlist"/>
         <w:numPr>
           <w:ilvl w:val="0"/>
-          <w:numId w:val="14"/>
+          <w:numId w:val="15"/>
+        </w:numPr>
+        <w:jc w:val="both"/>
+      </w:pPr>
+      <w:r>
+        <w:t>Panel nawigacyjny służący do przechodzenia do innych zakładek raportu. Po najechaniu kursorem myszy na ikonę wyświetla się podpowiedź docelowej strony.</w:t>
+      </w:r>
+    </w:p>
+    <w:p>
+      <w:pPr>
+        <w:pStyle w:val="Akapitzlist"/>
+        <w:numPr>
+          <w:ilvl w:val="0"/>
+          <w:numId w:val="15"/>
+        </w:numPr>
+        <w:jc w:val="both"/>
+      </w:pPr>
+      <w:r>
+        <w:t xml:space="preserve">Panel do wyboru handlowca dla którego wyświetlane są dane w raporcie. </w:t>
+      </w:r>
+    </w:p>
+    <w:p>
+      <w:pPr>
+        <w:pStyle w:val="Akapitzlist"/>
+        <w:numPr>
+          <w:ilvl w:val="0"/>
+          <w:numId w:val="15"/>
+        </w:numPr>
+        <w:jc w:val="both"/>
+      </w:pPr>
+      <w:r>
+        <w:t xml:space="preserve">Filtr dat służący do wyboru roku oraz miesiąca dla którego wyświetlane są dane na wizualizacji. </w:t>
+      </w:r>
+    </w:p>
+    <w:p>
+      <w:pPr>
+        <w:pStyle w:val="Akapitzlist"/>
+        <w:numPr>
+          <w:ilvl w:val="0"/>
+          <w:numId w:val="15"/>
         </w:numPr>
       </w:pPr>
       <w:r>
@@ -3878,7 +3890,7 @@
         <w:pStyle w:val="Akapitzlist"/>
         <w:numPr>
           <w:ilvl w:val="0"/>
-          <w:numId w:val="14"/>
+          <w:numId w:val="15"/>
         </w:numPr>
       </w:pPr>
       <w:r>
@@ -3893,96 +3905,18 @@
         <w:pStyle w:val="Akapitzlist"/>
         <w:numPr>
           <w:ilvl w:val="0"/>
-          <w:numId w:val="14"/>
-        </w:numPr>
-      </w:pPr>
-      <w:r>
-        <w:t xml:space="preserve">Filtr dat służący do wyboru roku oraz miesiąca dla którego wyświetlane są dane na wizualizacji. </w:t>
-      </w:r>
-    </w:p>
-    <w:p>
-      <w:pPr>
-        <w:pStyle w:val="Akapitzlist"/>
-        <w:ind w:left="360"/>
-      </w:pPr>
-      <w:r>
-        <w:t>Po przytrzymaniu klawisza „</w:t>
-      </w:r>
-      <w:proofErr w:type="spellStart"/>
-      <w:r>
-        <w:t>ctrl</w:t>
-      </w:r>
-      <w:proofErr w:type="spellEnd"/>
-      <w:r>
-        <w:t>„ na klawiaturze możliwe jest wybranie kilku miesięcy lub lat.</w:t>
-      </w:r>
-    </w:p>
-    <w:p>
-      <w:pPr>
-        <w:pStyle w:val="Akapitzlist"/>
-        <w:ind w:left="360"/>
-      </w:pPr>
-      <w:r>
-        <w:t>Wybrane daty wpływają na dane wyświetlane również na stronach Klienci, Faktury, Regiony i typy urządzeń.</w:t>
-      </w:r>
-    </w:p>
-    <w:p>
-      <w:pPr>
-        <w:pStyle w:val="Akapitzlist"/>
-        <w:numPr>
-          <w:ilvl w:val="0"/>
-          <w:numId w:val="14"/>
-        </w:numPr>
-        <w:jc w:val="both"/>
-      </w:pPr>
-      <w:r>
-        <w:t>Wyczyść wszystkie – przycisk służący do resetowania wszystkich wybranych filt</w:t>
-      </w:r>
-      <w:r>
-        <w:t>r</w:t>
-      </w:r>
-      <w:r>
-        <w:t>ów.</w:t>
-      </w:r>
-    </w:p>
-    <w:p>
-      <w:pPr>
-        <w:pStyle w:val="Akapitzlist"/>
-        <w:numPr>
-          <w:ilvl w:val="0"/>
-          <w:numId w:val="14"/>
-        </w:numPr>
-        <w:jc w:val="both"/>
-      </w:pPr>
-      <w:r>
-        <w:lastRenderedPageBreak/>
-        <w:t>Tabela przedstawiająca wartość sprzedaży dla zapłaconych faktur w podziale na grupy produktowe oraz regiony.</w:t>
-      </w:r>
-    </w:p>
-    <w:p>
-      <w:pPr>
-        <w:pStyle w:val="Akapitzlist"/>
-        <w:numPr>
-          <w:ilvl w:val="0"/>
-          <w:numId w:val="14"/>
-        </w:numPr>
-        <w:jc w:val="both"/>
-      </w:pPr>
-      <w:r>
-        <w:t>Panel nawigacyjny służący do przechodzenia do innych zakładek raportu. Po najechaniu kursorem myszy na ikonę wyświetla się podpowiedź docelowej strony.</w:t>
-      </w:r>
-    </w:p>
-    <w:p>
-      <w:pPr>
-        <w:pStyle w:val="Akapitzlist"/>
-        <w:numPr>
-          <w:ilvl w:val="0"/>
-          <w:numId w:val="14"/>
-        </w:numPr>
-        <w:jc w:val="both"/>
-      </w:pPr>
-      <w:r>
-        <w:t>Panel do wyboru handlowca dla którego wyświetlane są dane w raporcie.</w:t>
+          <w:numId w:val="15"/>
+        </w:numPr>
+        <w:jc w:val="both"/>
+      </w:pPr>
+      <w:r>
+        <w:t>Tabela przedstawiająca wartość sprzedaży dla zapłaconych faktur</w:t>
+      </w:r>
+      <w:r>
+        <w:t>, marżę % oraz zysk osiągnięty na sprzedaży towarów</w:t>
+      </w:r>
+      <w:r>
+        <w:t xml:space="preserve"> w podziale na grupy produktowe oraz regiony.</w:t>
       </w:r>
     </w:p>
     <w:p>
@@ -4002,6 +3936,56 @@
 </w:document>
 </file>
 
+<file path=word/endnotes.xml><?xml version="1.0" encoding="utf-8"?>
+<w:endnotes xmlns:wpc="http://schemas.microsoft.com/office/word/2010/wordprocessingCanvas" xmlns:cx="http://schemas.microsoft.com/office/drawing/2014/chartex" xmlns:cx1="http://schemas.microsoft.com/office/drawing/2015/9/8/chartex" xmlns:cx2="http://schemas.microsoft.com/office/drawing/2015/10/21/chartex" xmlns:cx3="http://schemas.microsoft.com/office/drawing/2016/5/9/chartex" xmlns:cx4="http://schemas.microsoft.com/office/drawing/2016/5/10/chartex" xmlns:cx5="http://schemas.microsoft.com/office/drawing/2016/5/11/chartex" xmlns:cx6="http://schemas.microsoft.com/office/drawing/2016/5/12/chartex" xmlns:cx7="http://schemas.microsoft.com/office/drawing/2016/5/13/chartex" xmlns:cx8="http://schemas.microsoft.com/office/drawing/2016/5/14/chartex" xmlns:mc="http://schemas.openxmlformats.org/markup-compatibility/2006" xmlns:aink="http://schemas.microsoft.com/office/drawing/2016/ink" xmlns:am3d="http://schemas.microsoft.com/office/drawing/2017/model3d" xmlns:o="urn:schemas-microsoft-com:office:office" xmlns:oel="http://schemas.microsoft.com/office/2019/extlst" xmlns:r="http://schemas.openxmlformats.org/officeDocument/2006/relationships" xmlns:m="http://schemas.openxmlformats.org/officeDocument/2006/math" xmlns:v="urn:schemas-microsoft-com:vml" xmlns:wp14="http://schemas.microsoft.com/office/word/2010/wordprocessingDrawing" xmlns:wp="http://schemas.openxmlformats.org/drawingml/2006/wordprocessingDrawing" xmlns:w10="urn:schemas-microsoft-com:office:word" xmlns:w="http://schemas.openxmlformats.org/wordprocessingml/2006/main" xmlns:w14="http://schemas.microsoft.com/office/word/2010/wordml" xmlns:w15="http://schemas.microsoft.com/office/word/2012/wordml" xmlns:w16cex="http://schemas.microsoft.com/office/word/2018/wordml/cex" xmlns:w16cid="http://schemas.microsoft.com/office/word/2016/wordml/cid" xmlns:w16="http://schemas.microsoft.com/office/word/2018/wordml" xmlns:w16du="http://schemas.microsoft.com/office/word/2023/wordml/word16du" xmlns:w16sdtdh="http://schemas.microsoft.com/office/word/2020/wordml/sdtdatahash" xmlns:w16sdtfl="http://schemas.microsoft.com/office/word/2024/wordml/sdtformatlock" xmlns:w16se="http://schemas.microsoft.com/office/word/2015/wordml/symex" xmlns:wpg="http://schemas.microsoft.com/office/word/2010/wordprocessingGroup" xmlns:wpi="http://schemas.microsoft.com/office/word/2010/wordprocessingInk" xmlns:wne="http://schemas.microsoft.com/office/word/2006/wordml" xmlns:wps="http://schemas.microsoft.com/office/word/2010/wordprocessingShape" mc:Ignorable="w14 w15 w16se w16cid w16 w16cex w16sdtdh w16sdtfl w16du wp14">
+  <w:endnote w:type="separator" w:id="-1">
+    <w:p>
+      <w:pPr>
+        <w:spacing w:after="0" w:line="240" w:lineRule="auto"/>
+      </w:pPr>
+      <w:r>
+        <w:separator/>
+      </w:r>
+    </w:p>
+  </w:endnote>
+  <w:endnote w:type="continuationSeparator" w:id="0">
+    <w:p>
+      <w:pPr>
+        <w:spacing w:after="0" w:line="240" w:lineRule="auto"/>
+      </w:pPr>
+      <w:r>
+        <w:continuationSeparator/>
+      </w:r>
+    </w:p>
+  </w:endnote>
+</w:endnotes>
+</file>
+
+<file path=word/footnotes.xml><?xml version="1.0" encoding="utf-8"?>
+<w:footnotes xmlns:wpc="http://schemas.microsoft.com/office/word/2010/wordprocessingCanvas" xmlns:cx="http://schemas.microsoft.com/office/drawing/2014/chartex" xmlns:cx1="http://schemas.microsoft.com/office/drawing/2015/9/8/chartex" xmlns:cx2="http://schemas.microsoft.com/office/drawing/2015/10/21/chartex" xmlns:cx3="http://schemas.microsoft.com/office/drawing/2016/5/9/chartex" xmlns:cx4="http://schemas.microsoft.com/office/drawing/2016/5/10/chartex" xmlns:cx5="http://schemas.microsoft.com/office/drawing/2016/5/11/chartex" xmlns:cx6="http://schemas.microsoft.com/office/drawing/2016/5/12/chartex" xmlns:cx7="http://schemas.microsoft.com/office/drawing/2016/5/13/chartex" xmlns:cx8="http://schemas.microsoft.com/office/drawing/2016/5/14/chartex" xmlns:mc="http://schemas.openxmlformats.org/markup-compatibility/2006" xmlns:aink="http://schemas.microsoft.com/office/drawing/2016/ink" xmlns:am3d="http://schemas.microsoft.com/office/drawing/2017/model3d" xmlns:o="urn:schemas-microsoft-com:office:office" xmlns:oel="http://schemas.microsoft.com/office/2019/extlst" xmlns:r="http://schemas.openxmlformats.org/officeDocument/2006/relationships" xmlns:m="http://schemas.openxmlformats.org/officeDocument/2006/math" xmlns:v="urn:schemas-microsoft-com:vml" xmlns:wp14="http://schemas.microsoft.com/office/word/2010/wordprocessingDrawing" xmlns:wp="http://schemas.openxmlformats.org/drawingml/2006/wordprocessingDrawing" xmlns:w10="urn:schemas-microsoft-com:office:word" xmlns:w="http://schemas.openxmlformats.org/wordprocessingml/2006/main" xmlns:w14="http://schemas.microsoft.com/office/word/2010/wordml" xmlns:w15="http://schemas.microsoft.com/office/word/2012/wordml" xmlns:w16cex="http://schemas.microsoft.com/office/word/2018/wordml/cex" xmlns:w16cid="http://schemas.microsoft.com/office/word/2016/wordml/cid" xmlns:w16="http://schemas.microsoft.com/office/word/2018/wordml" xmlns:w16du="http://schemas.microsoft.com/office/word/2023/wordml/word16du" xmlns:w16sdtdh="http://schemas.microsoft.com/office/word/2020/wordml/sdtdatahash" xmlns:w16sdtfl="http://schemas.microsoft.com/office/word/2024/wordml/sdtformatlock" xmlns:w16se="http://schemas.microsoft.com/office/word/2015/wordml/symex" xmlns:wpg="http://schemas.microsoft.com/office/word/2010/wordprocessingGroup" xmlns:wpi="http://schemas.microsoft.com/office/word/2010/wordprocessingInk" xmlns:wne="http://schemas.microsoft.com/office/word/2006/wordml" xmlns:wps="http://schemas.microsoft.com/office/word/2010/wordprocessingShape" mc:Ignorable="w14 w15 w16se w16cid w16 w16cex w16sdtdh w16sdtfl w16du wp14">
+  <w:footnote w:type="separator" w:id="-1">
+    <w:p>
+      <w:pPr>
+        <w:spacing w:after="0" w:line="240" w:lineRule="auto"/>
+      </w:pPr>
+      <w:r>
+        <w:separator/>
+      </w:r>
+    </w:p>
+  </w:footnote>
+  <w:footnote w:type="continuationSeparator" w:id="0">
+    <w:p>
+      <w:pPr>
+        <w:spacing w:after="0" w:line="240" w:lineRule="auto"/>
+      </w:pPr>
+      <w:r>
+        <w:continuationSeparator/>
+      </w:r>
+    </w:p>
+  </w:footnote>
+</w:footnotes>
+</file>
+
 <file path=word/numbering.xml><?xml version="1.0" encoding="utf-8"?>
 <w:numbering xmlns:wpc="http://schemas.microsoft.com/office/word/2010/wordprocessingCanvas" xmlns:cx="http://schemas.microsoft.com/office/drawing/2014/chartex" xmlns:cx1="http://schemas.microsoft.com/office/drawing/2015/9/8/chartex" xmlns:cx2="http://schemas.microsoft.com/office/drawing/2015/10/21/chartex" xmlns:cx3="http://schemas.microsoft.com/office/drawing/2016/5/9/chartex" xmlns:cx4="http://schemas.microsoft.com/office/drawing/2016/5/10/chartex" xmlns:cx5="http://schemas.microsoft.com/office/drawing/2016/5/11/chartex" xmlns:cx6="http://schemas.microsoft.com/office/drawing/2016/5/12/chartex" xmlns:cx7="http://schemas.microsoft.com/office/drawing/2016/5/13/chartex" xmlns:cx8="http://schemas.microsoft.com/office/drawing/2016/5/14/chartex" xmlns:mc="http://schemas.openxmlformats.org/markup-compatibility/2006" xmlns:aink="http://schemas.microsoft.com/office/drawing/2016/ink" xmlns:am3d="http://schemas.microsoft.com/office/drawing/2017/model3d" xmlns:o="urn:schemas-microsoft-com:office:office" xmlns:oel="http://schemas.microsoft.com/office/2019/extlst" xmlns:r="http://schemas.openxmlformats.org/officeDocument/2006/relationships" xmlns:m="http://schemas.openxmlformats.org/officeDocument/2006/math" xmlns:v="urn:schemas-microsoft-com:vml" xmlns:wp14="http://schemas.microsoft.com/office/word/2010/wordprocessingDrawing" xmlns:wp="http://schemas.openxmlformats.org/drawingml/2006/wordprocessingDrawing" xmlns:w10="urn:schemas-microsoft-com:office:word" xmlns:w="http://schemas.openxmlformats.org/wordprocessingml/2006/main" xmlns:w14="http://schemas.microsoft.com/office/word/2010/wordml" xmlns:w15="http://schemas.microsoft.com/office/word/2012/wordml" xmlns:w16cex="http://schemas.microsoft.com/office/word/2018/wordml/cex" xmlns:w16cid="http://schemas.microsoft.com/office/word/2016/wordml/cid" xmlns:w16="http://schemas.microsoft.com/office/word/2018/wordml" xmlns:w16du="http://schemas.microsoft.com/office/word/2023/wordml/word16du" xmlns:w16sdtdh="http://schemas.microsoft.com/office/word/2020/wordml/sdtdatahash" xmlns:w16sdtfl="http://schemas.microsoft.com/office/word/2024/wordml/sdtformatlock" xmlns:w16se="http://schemas.microsoft.com/office/word/2015/wordml/symex" xmlns:wpg="http://schemas.microsoft.com/office/word/2010/wordprocessingGroup" xmlns:wpi="http://schemas.microsoft.com/office/word/2010/wordprocessingInk" xmlns:wne="http://schemas.microsoft.com/office/word/2006/wordml" xmlns:wps="http://schemas.microsoft.com/office/word/2010/wordprocessingShape" mc:Ignorable="w14 w15 w16se w16cid w16 w16cex w16sdtdh w16sdtfl w16du wp14">
   <w:abstractNum w:abstractNumId="0" w15:restartNumberingAfterBreak="0">
@@ -4186,7 +4170,7 @@
   <w:abstractNum w:abstractNumId="2" w15:restartNumberingAfterBreak="0">
     <w:nsid w:val="1CC15BC2"/>
     <w:multiLevelType w:val="hybridMultilevel"/>
-    <w:tmpl w:val="41EECB22"/>
+    <w:tmpl w:val="85AA4A88"/>
     <w:lvl w:ilvl="0" w:tplc="FFFFFFFF">
       <w:start w:val="1"/>
       <w:numFmt w:val="decimal"/>
@@ -4362,6 +4346,92 @@
     </w:lvl>
   </w:abstractNum>
   <w:abstractNum w:abstractNumId="4" w15:restartNumberingAfterBreak="0">
+    <w:nsid w:val="2F3257D3"/>
+    <w:multiLevelType w:val="hybridMultilevel"/>
+    <w:tmpl w:val="E638870A"/>
+    <w:lvl w:ilvl="0" w:tplc="0415000F">
+      <w:start w:val="1"/>
+      <w:numFmt w:val="decimal"/>
+      <w:lvlText w:val="%1."/>
+      <w:lvlJc w:val="left"/>
+      <w:pPr>
+        <w:ind w:left="360" w:hanging="360"/>
+      </w:pPr>
+    </w:lvl>
+    <w:lvl w:ilvl="1" w:tplc="04150019" w:tentative="1">
+      <w:start w:val="1"/>
+      <w:numFmt w:val="lowerLetter"/>
+      <w:lvlText w:val="%2."/>
+      <w:lvlJc w:val="left"/>
+      <w:pPr>
+        <w:ind w:left="1080" w:hanging="360"/>
+      </w:pPr>
+    </w:lvl>
+    <w:lvl w:ilvl="2" w:tplc="0415001B" w:tentative="1">
+      <w:start w:val="1"/>
+      <w:numFmt w:val="lowerRoman"/>
+      <w:lvlText w:val="%3."/>
+      <w:lvlJc w:val="right"/>
+      <w:pPr>
+        <w:ind w:left="1800" w:hanging="180"/>
+      </w:pPr>
+    </w:lvl>
+    <w:lvl w:ilvl="3" w:tplc="0415000F" w:tentative="1">
+      <w:start w:val="1"/>
+      <w:numFmt w:val="decimal"/>
+      <w:lvlText w:val="%4."/>
+      <w:lvlJc w:val="left"/>
+      <w:pPr>
+        <w:ind w:left="2520" w:hanging="360"/>
+      </w:pPr>
+    </w:lvl>
+    <w:lvl w:ilvl="4" w:tplc="04150019" w:tentative="1">
+      <w:start w:val="1"/>
+      <w:numFmt w:val="lowerLetter"/>
+      <w:lvlText w:val="%5."/>
+      <w:lvlJc w:val="left"/>
+      <w:pPr>
+        <w:ind w:left="3240" w:hanging="360"/>
+      </w:pPr>
+    </w:lvl>
+    <w:lvl w:ilvl="5" w:tplc="0415001B" w:tentative="1">
+      <w:start w:val="1"/>
+      <w:numFmt w:val="lowerRoman"/>
+      <w:lvlText w:val="%6."/>
+      <w:lvlJc w:val="right"/>
+      <w:pPr>
+        <w:ind w:left="3960" w:hanging="180"/>
+      </w:pPr>
+    </w:lvl>
+    <w:lvl w:ilvl="6" w:tplc="0415000F" w:tentative="1">
+      <w:start w:val="1"/>
+      <w:numFmt w:val="decimal"/>
+      <w:lvlText w:val="%7."/>
+      <w:lvlJc w:val="left"/>
+      <w:pPr>
+        <w:ind w:left="4680" w:hanging="360"/>
+      </w:pPr>
+    </w:lvl>
+    <w:lvl w:ilvl="7" w:tplc="04150019" w:tentative="1">
+      <w:start w:val="1"/>
+      <w:numFmt w:val="lowerLetter"/>
+      <w:lvlText w:val="%8."/>
+      <w:lvlJc w:val="left"/>
+      <w:pPr>
+        <w:ind w:left="5400" w:hanging="360"/>
+      </w:pPr>
+    </w:lvl>
+    <w:lvl w:ilvl="8" w:tplc="0415001B" w:tentative="1">
+      <w:start w:val="1"/>
+      <w:numFmt w:val="lowerRoman"/>
+      <w:lvlText w:val="%9."/>
+      <w:lvlJc w:val="right"/>
+      <w:pPr>
+        <w:ind w:left="6120" w:hanging="180"/>
+      </w:pPr>
+    </w:lvl>
+  </w:abstractNum>
+  <w:abstractNum w:abstractNumId="5" w15:restartNumberingAfterBreak="0">
     <w:nsid w:val="30B7148B"/>
     <w:multiLevelType w:val="hybridMultilevel"/>
     <w:tmpl w:val="CF34740C"/>
@@ -4450,7 +4520,7 @@
       </w:pPr>
     </w:lvl>
   </w:abstractNum>
-  <w:abstractNum w:abstractNumId="5" w15:restartNumberingAfterBreak="0">
+  <w:abstractNum w:abstractNumId="6" w15:restartNumberingAfterBreak="0">
     <w:nsid w:val="3A702CC6"/>
     <w:multiLevelType w:val="hybridMultilevel"/>
     <w:tmpl w:val="69D2FF44"/>
@@ -4539,7 +4609,7 @@
       </w:pPr>
     </w:lvl>
   </w:abstractNum>
-  <w:abstractNum w:abstractNumId="6" w15:restartNumberingAfterBreak="0">
+  <w:abstractNum w:abstractNumId="7" w15:restartNumberingAfterBreak="0">
     <w:nsid w:val="461B438A"/>
     <w:multiLevelType w:val="hybridMultilevel"/>
     <w:tmpl w:val="E47CEE1C"/>
@@ -4628,7 +4698,7 @@
       </w:pPr>
     </w:lvl>
   </w:abstractNum>
-  <w:abstractNum w:abstractNumId="7" w15:restartNumberingAfterBreak="0">
+  <w:abstractNum w:abstractNumId="8" w15:restartNumberingAfterBreak="0">
     <w:nsid w:val="471B1BEA"/>
     <w:multiLevelType w:val="hybridMultilevel"/>
     <w:tmpl w:val="3722764E"/>
@@ -4714,7 +4784,7 @@
       </w:pPr>
     </w:lvl>
   </w:abstractNum>
-  <w:abstractNum w:abstractNumId="8" w15:restartNumberingAfterBreak="0">
+  <w:abstractNum w:abstractNumId="9" w15:restartNumberingAfterBreak="0">
     <w:nsid w:val="4A6725F3"/>
     <w:multiLevelType w:val="hybridMultilevel"/>
     <w:tmpl w:val="CADE1B5E"/>
@@ -4803,7 +4873,7 @@
       </w:pPr>
     </w:lvl>
   </w:abstractNum>
-  <w:abstractNum w:abstractNumId="9" w15:restartNumberingAfterBreak="0">
+  <w:abstractNum w:abstractNumId="10" w15:restartNumberingAfterBreak="0">
     <w:nsid w:val="4FBA5FA7"/>
     <w:multiLevelType w:val="hybridMultilevel"/>
     <w:tmpl w:val="BA96AD2C"/>
@@ -4892,7 +4962,7 @@
       </w:pPr>
     </w:lvl>
   </w:abstractNum>
-  <w:abstractNum w:abstractNumId="10" w15:restartNumberingAfterBreak="0">
+  <w:abstractNum w:abstractNumId="11" w15:restartNumberingAfterBreak="0">
     <w:nsid w:val="5A36045C"/>
     <w:multiLevelType w:val="hybridMultilevel"/>
     <w:tmpl w:val="EC3EBB80"/>
@@ -4981,7 +5051,7 @@
       </w:pPr>
     </w:lvl>
   </w:abstractNum>
-  <w:abstractNum w:abstractNumId="11" w15:restartNumberingAfterBreak="0">
+  <w:abstractNum w:abstractNumId="12" w15:restartNumberingAfterBreak="0">
     <w:nsid w:val="76ED299A"/>
     <w:multiLevelType w:val="hybridMultilevel"/>
     <w:tmpl w:val="FE1C29FE"/>
@@ -5070,7 +5140,7 @@
       </w:pPr>
     </w:lvl>
   </w:abstractNum>
-  <w:abstractNum w:abstractNumId="12" w15:restartNumberingAfterBreak="0">
+  <w:abstractNum w:abstractNumId="13" w15:restartNumberingAfterBreak="0">
     <w:nsid w:val="786E715D"/>
     <w:multiLevelType w:val="hybridMultilevel"/>
     <w:tmpl w:val="B54A45A6"/>
@@ -5160,13 +5230,13 @@
     </w:lvl>
   </w:abstractNum>
   <w:num w:numId="1" w16cid:durableId="362287713">
-    <w:abstractNumId w:val="7"/>
+    <w:abstractNumId w:val="8"/>
   </w:num>
   <w:num w:numId="2" w16cid:durableId="1122960407">
     <w:abstractNumId w:val="0"/>
   </w:num>
   <w:num w:numId="3" w16cid:durableId="1326084349">
-    <w:abstractNumId w:val="9"/>
+    <w:abstractNumId w:val="10"/>
   </w:num>
   <w:num w:numId="4" w16cid:durableId="1557813846">
     <w:abstractNumId w:val="0"/>
@@ -5178,30 +5248,33 @@
     <w:abstractNumId w:val="2"/>
   </w:num>
   <w:num w:numId="6" w16cid:durableId="1660227816">
-    <w:abstractNumId w:val="5"/>
+    <w:abstractNumId w:val="6"/>
   </w:num>
   <w:num w:numId="7" w16cid:durableId="1459449067">
-    <w:abstractNumId w:val="8"/>
+    <w:abstractNumId w:val="9"/>
   </w:num>
   <w:num w:numId="8" w16cid:durableId="770709036">
-    <w:abstractNumId w:val="11"/>
+    <w:abstractNumId w:val="12"/>
   </w:num>
   <w:num w:numId="9" w16cid:durableId="1854877330">
     <w:abstractNumId w:val="3"/>
   </w:num>
   <w:num w:numId="10" w16cid:durableId="2069179690">
-    <w:abstractNumId w:val="6"/>
+    <w:abstractNumId w:val="7"/>
   </w:num>
   <w:num w:numId="11" w16cid:durableId="99381608">
     <w:abstractNumId w:val="1"/>
   </w:num>
   <w:num w:numId="12" w16cid:durableId="1205215640">
-    <w:abstractNumId w:val="12"/>
+    <w:abstractNumId w:val="13"/>
   </w:num>
   <w:num w:numId="13" w16cid:durableId="690108775">
-    <w:abstractNumId w:val="10"/>
+    <w:abstractNumId w:val="11"/>
   </w:num>
   <w:num w:numId="14" w16cid:durableId="1041396422">
+    <w:abstractNumId w:val="5"/>
+  </w:num>
+  <w:num w:numId="15" w16cid:durableId="835532153">
     <w:abstractNumId w:val="4"/>
   </w:num>
 </w:numbering>
@@ -6192,6 +6265,45 @@
       <w:u w:val="single"/>
     </w:rPr>
   </w:style>
+  <w:style w:type="paragraph" w:styleId="Tekstprzypisukocowego">
+    <w:name w:val="endnote text"/>
+    <w:basedOn w:val="Normalny"/>
+    <w:link w:val="TekstprzypisukocowegoZnak"/>
+    <w:uiPriority w:val="99"/>
+    <w:semiHidden/>
+    <w:unhideWhenUsed/>
+    <w:rsid w:val="00771AD0"/>
+    <w:pPr>
+      <w:spacing w:after="0" w:line="240" w:lineRule="auto"/>
+    </w:pPr>
+    <w:rPr>
+      <w:sz w:val="20"/>
+      <w:szCs w:val="20"/>
+    </w:rPr>
+  </w:style>
+  <w:style w:type="character" w:customStyle="1" w:styleId="TekstprzypisukocowegoZnak">
+    <w:name w:val="Tekst przypisu końcowego Znak"/>
+    <w:basedOn w:val="Domylnaczcionkaakapitu"/>
+    <w:link w:val="Tekstprzypisukocowego"/>
+    <w:uiPriority w:val="99"/>
+    <w:semiHidden/>
+    <w:rsid w:val="00771AD0"/>
+    <w:rPr>
+      <w:sz w:val="20"/>
+      <w:szCs w:val="20"/>
+    </w:rPr>
+  </w:style>
+  <w:style w:type="character" w:styleId="Odwoanieprzypisukocowego">
+    <w:name w:val="endnote reference"/>
+    <w:basedOn w:val="Domylnaczcionkaakapitu"/>
+    <w:uiPriority w:val="99"/>
+    <w:semiHidden/>
+    <w:unhideWhenUsed/>
+    <w:rsid w:val="00771AD0"/>
+    <w:rPr>
+      <w:vertAlign w:val="superscript"/>
+    </w:rPr>
+  </w:style>
 </w:styles>
 </file>
 

</xml_diff>